<commit_message>
docs(mercado,tecnico): textos introductorios, sección 3 separada, precios reales de mercado y ajustes operativos
- Sección 3: 3.3 a 3.5 separadas (presentación con impacto en costos, composición y características físicas solo texto); 3.7/3.8 y 3.9-3.11 en secciones propias con introducción
- 3.12: precios reales de 5 restaurantes (Rappi, dameramen.com) e insumos con fuente (SIPSA-DANE, Global Gourmet Market)
- Párrafos explicativos en la sección 4 (demanda) y en todas las subsecciones que solo tenían tabla, en ambos documentos
- Nivel de precio de la competencia como precio bajo/medio/alto
- Surtigas (gas) y Pacaribe (aseo); frecuencias de compra según WISK (2022)
- Horario continuo de 12:00 m. a 10:00 p. m. (3 franjas de rotación); tiempos de entrega realistas
- Rollo de 10 piezas (≈ 320 g): nuevo costo 1.087 MP / 1.768 unitario

Co-Authored-By: Claude Opus 5.5 <noreply@anthropic.com>
Claude-Session: https://claude.ai/code/session_01DvLKNimVRrvQKw6BC5SVu6
</commit_message>
<xml_diff>
--- a/entregables_word/Taller_2_Estudio_Tecnico_Kazegami.docx
+++ b/entregables_word/Taller_2_Estudio_Tecnico_Kazegami.docx
@@ -674,7 +674,7 @@
               <w:rPr>
                 <w:sz w:val="18"/>
               </w:rPr>
-              <w:t xml:space="preserve">Almuerzo y cena; experiencia 100 % en el local</w:t>
+              <w:t xml:space="preserve">Martes a domingo, horario continuo de 12:00 m. a 10:00 p. m.; experiencia 100 % en el local</w:t>
             </w:r>
           </w:p>
         </w:tc>
@@ -1300,6 +1300,14 @@
     </w:p>
     <w:p>
       <w:pPr>
+        <w:pStyle w:val="FirstParagraph"/>
+      </w:pPr>
+      <w:r>
+        <w:t xml:space="preserve">La macrolocalización define la región y la ciudad donde operará el restaurante. Se analiza de lo general a lo particular —país, región, ciudad y zona— y en cada nivel se indican los factores que justifican la elección, con datos de población, turismo y de la encuesta.</w:t>
+      </w:r>
+    </w:p>
+    <w:p>
+      <w:pPr>
         <w:pStyle w:val="TableCaption"/>
       </w:pPr>
       <w:r>
@@ -1999,7 +2007,7 @@
               <w:rPr>
                 <w:sz w:val="18"/>
               </w:rPr>
-              <w:t xml:space="preserve">Afinia, Acuacar, Gases del Caribe; cortes de energía frecuentes</w:t>
+              <w:t xml:space="preserve">Afinia (energía), Acuacar (agua), Surtigas (gas natural) y Pacaribe (aseo); cortes de energía frecuentes</w:t>
             </w:r>
           </w:p>
         </w:tc>
@@ -5732,6 +5740,14 @@
     </w:p>
     <w:p>
       <w:pPr>
+        <w:pStyle w:val="FirstParagraph"/>
+      </w:pPr>
+      <w:r>
+        <w:t xml:space="preserve">El tamaño del proyecto es la capacidad de producción de Kazegami, medida en platos por año. Antes de calcularlo se revisan los factores que lo limitan o lo favorecen: la demanda insatisfecha, la disponibilidad de insumos, la tecnología, el financiamiento, la capacidad de la barra de sushi y la organización.</w:t>
+      </w:r>
+    </w:p>
+    <w:p>
+      <w:pPr>
         <w:pStyle w:val="TableCaption"/>
       </w:pPr>
       <w:r>
@@ -5921,7 +5937,7 @@
               <w:rPr>
                 <w:sz w:val="18"/>
               </w:rPr>
-              <w:t xml:space="preserve">Pesca artesanal diaria; importados con stock de 1 mes</w:t>
+              <w:t xml:space="preserve">Pesca artesanal comprada 2 veces por semana y ultracongelada; importados con stock de 1 mes</w:t>
             </w:r>
           </w:p>
         </w:tc>
@@ -6184,6 +6200,14 @@
       </w:pPr>
       <w:r>
         <w:t xml:space="preserve">3.1 Capacidad diseñada (máxima teórica)</w:t>
+      </w:r>
+    </w:p>
+    <w:p>
+      <w:pPr>
+        <w:pStyle w:val="FirstParagraph"/>
+      </w:pPr>
+      <w:r>
+        <w:t xml:space="preserve">La capacidad diseñada es la producción máxima que el local podría alcanzar si todos sus puestos se ocuparan en cada rotación durante todo el horario. Con el horario continuo de 12:00 m. a 10:00 p. m., el día se divide en tres franjas: el almuerzo, la tarde (horas valle) y la noche. La tabla muestra el cálculo paso a paso.</w:t>
       </w:r>
     </w:p>
     <w:p>
@@ -6468,7 +6492,7 @@
               <w:rPr>
                 <w:sz w:val="18"/>
               </w:rPr>
-              <w:t xml:space="preserve">Rotación en almuerzo (12:00-15:00)</w:t>
+              <w:t xml:space="preserve">Rotación franja de almuerzo (12:00 m. - 3:00 p. m.)</w:t>
             </w:r>
           </w:p>
         </w:tc>
@@ -6525,7 +6549,7 @@
               <w:rPr>
                 <w:sz w:val="18"/>
               </w:rPr>
-              <w:t xml:space="preserve">Rotación en cena (18:00-22:30)</w:t>
+              <w:t xml:space="preserve">Rotación franja de la tarde (3:00 p. m. - 6:00 p. m.)</w:t>
             </w:r>
           </w:p>
         </w:tc>
@@ -6541,7 +6565,7 @@
               <w:rPr>
                 <w:sz w:val="18"/>
               </w:rPr>
-              <w:t xml:space="preserve">2,0</w:t>
+              <w:t xml:space="preserve">0,5</w:t>
             </w:r>
           </w:p>
         </w:tc>
@@ -6557,7 +6581,7 @@
               <w:rPr>
                 <w:sz w:val="18"/>
               </w:rPr>
-              <w:t xml:space="preserve">Estancia promedio de 90 min</w:t>
+              <w:t xml:space="preserve">Horas valle: medio salón ocupado</w:t>
             </w:r>
           </w:p>
         </w:tc>
@@ -6580,7 +6604,7 @@
               <w:rPr>
                 <w:sz w:val="18"/>
               </w:rPr>
-              <w:t xml:space="preserve">Comensales por día</w:t>
+              <w:t xml:space="preserve">Rotación franja de la noche (6:00 p. m. - 10:00 p. m.)</w:t>
             </w:r>
           </w:p>
         </w:tc>
@@ -6598,7 +6622,7 @@
               <w:rPr>
                 <w:sz w:val="18"/>
               </w:rPr>
-              <w:t xml:space="preserve">196</w:t>
+              <w:t xml:space="preserve">1,5</w:t>
             </w:r>
           </w:p>
         </w:tc>
@@ -6616,7 +6640,7 @@
               <w:rPr>
                 <w:sz w:val="18"/>
               </w:rPr>
-              <w:t xml:space="preserve">56 × 3,5</w:t>
+              <w:t xml:space="preserve">Estancia promedio de 90 min</w:t>
             </w:r>
           </w:p>
         </w:tc>
@@ -6637,7 +6661,7 @@
               <w:rPr>
                 <w:sz w:val="18"/>
               </w:rPr>
-              <w:t xml:space="preserve">Platos del Top 3 por comensal</w:t>
+              <w:t xml:space="preserve">Comensales por día</w:t>
             </w:r>
           </w:p>
         </w:tc>
@@ -6653,7 +6677,7 @@
               <w:rPr>
                 <w:sz w:val="18"/>
               </w:rPr>
-              <w:t xml:space="preserve">1,2</w:t>
+              <w:t xml:space="preserve">196</w:t>
             </w:r>
           </w:p>
         </w:tc>
@@ -6669,7 +6693,7 @@
               <w:rPr>
                 <w:sz w:val="18"/>
               </w:rPr>
-              <w:t xml:space="preserve">Plato fuerte + tempura compartida</w:t>
+              <w:t xml:space="preserve">56 puestos × 3,5 rotaciones</w:t>
             </w:r>
           </w:p>
         </w:tc>
@@ -6692,7 +6716,7 @@
               <w:rPr>
                 <w:sz w:val="18"/>
               </w:rPr>
-              <w:t xml:space="preserve">Platos por día</w:t>
+              <w:t xml:space="preserve">Platos del Top 3 por comensal</w:t>
             </w:r>
           </w:p>
         </w:tc>
@@ -6710,19 +6734,26 @@
               <w:rPr>
                 <w:sz w:val="18"/>
               </w:rPr>
-              <w:t xml:space="preserve">235</w:t>
-            </w:r>
-          </w:p>
-        </w:tc>
-        <w:tc>
-          <w:tcPr>
-            <w:shd w:val="clear" w:color="auto" w:fill="F5F7FB"/>
-          </w:tcPr>
-          <w:p>
-            <w:pPr>
-              <w:pStyle w:val="Compact"/>
-              <w:spacing w:after="0" w:before="0" w:line="240" w:lineRule="auto"/>
-            </w:pPr>
+              <w:t xml:space="preserve">1,2</w:t>
+            </w:r>
+          </w:p>
+        </w:tc>
+        <w:tc>
+          <w:tcPr>
+            <w:shd w:val="clear" w:color="auto" w:fill="F5F7FB"/>
+          </w:tcPr>
+          <w:p>
+            <w:pPr>
+              <w:pStyle w:val="Compact"/>
+              <w:spacing w:after="0" w:before="0" w:line="240" w:lineRule="auto"/>
+              <w:jc w:val="left"/>
+            </w:pPr>
+            <w:r>
+              <w:rPr>
+                <w:sz w:val="18"/>
+              </w:rPr>
+              <w:t xml:space="preserve">Plato fuerte + tempura compartida</w:t>
+            </w:r>
           </w:p>
         </w:tc>
       </w:tr>
@@ -6742,7 +6773,7 @@
               <w:rPr>
                 <w:sz w:val="18"/>
               </w:rPr>
-              <w:t xml:space="preserve">Días de operación al año</w:t>
+              <w:t xml:space="preserve">Platos por día</w:t>
             </w:r>
           </w:p>
         </w:tc>
@@ -6758,24 +6789,17 @@
               <w:rPr>
                 <w:sz w:val="18"/>
               </w:rPr>
-              <w:t xml:space="preserve">312</w:t>
-            </w:r>
-          </w:p>
-        </w:tc>
-        <w:tc>
-          <w:tcPr/>
-          <w:p>
-            <w:pPr>
-              <w:pStyle w:val="Compact"/>
-              <w:spacing w:after="0" w:before="0" w:line="240" w:lineRule="auto"/>
-              <w:jc w:val="left"/>
-            </w:pPr>
-            <w:r>
-              <w:rPr>
-                <w:sz w:val="18"/>
-              </w:rPr>
-              <w:t xml:space="preserve">6 días por semana (lunes cerrado) × 52</w:t>
-            </w:r>
+              <w:t xml:space="preserve">235</w:t>
+            </w:r>
+          </w:p>
+        </w:tc>
+        <w:tc>
+          <w:tcPr/>
+          <w:p>
+            <w:pPr>
+              <w:pStyle w:val="Compact"/>
+              <w:spacing w:after="0" w:before="0" w:line="240" w:lineRule="auto"/>
+            </w:pPr>
           </w:p>
         </w:tc>
       </w:tr>
@@ -6795,6 +6819,63 @@
             </w:pPr>
             <w:r>
               <w:rPr>
+                <w:sz w:val="18"/>
+              </w:rPr>
+              <w:t xml:space="preserve">Días de operación al año</w:t>
+            </w:r>
+          </w:p>
+        </w:tc>
+        <w:tc>
+          <w:tcPr>
+            <w:shd w:val="clear" w:color="auto" w:fill="F5F7FB"/>
+          </w:tcPr>
+          <w:p>
+            <w:pPr>
+              <w:pStyle w:val="Compact"/>
+              <w:spacing w:after="0" w:before="0" w:line="240" w:lineRule="auto"/>
+              <w:jc w:val="right"/>
+            </w:pPr>
+            <w:r>
+              <w:rPr>
+                <w:sz w:val="18"/>
+              </w:rPr>
+              <w:t xml:space="preserve">312</w:t>
+            </w:r>
+          </w:p>
+        </w:tc>
+        <w:tc>
+          <w:tcPr>
+            <w:shd w:val="clear" w:color="auto" w:fill="F5F7FB"/>
+          </w:tcPr>
+          <w:p>
+            <w:pPr>
+              <w:pStyle w:val="Compact"/>
+              <w:spacing w:after="0" w:before="0" w:line="240" w:lineRule="auto"/>
+              <w:jc w:val="left"/>
+            </w:pPr>
+            <w:r>
+              <w:rPr>
+                <w:sz w:val="18"/>
+              </w:rPr>
+              <w:t xml:space="preserve">6 días por semana (lunes cerrado) × 52</w:t>
+            </w:r>
+          </w:p>
+        </w:tc>
+      </w:tr>
+      <w:tr>
+        <w:trPr>
+          <w:cantSplit/>
+        </w:trPr>
+        <w:tc>
+          <w:tcPr/>
+          <w:p>
+            <w:pPr>
+              <w:pStyle w:val="Compact"/>
+              <w:spacing w:after="0" w:before="0" w:line="240" w:lineRule="auto"/>
+              <w:jc w:val="left"/>
+            </w:pPr>
+            <w:r>
+              <w:rPr>
                 <w:bCs/>
                 <w:b/>
                 <w:sz w:val="18"/>
@@ -6804,9 +6885,7 @@
           </w:p>
         </w:tc>
         <w:tc>
-          <w:tcPr>
-            <w:shd w:val="clear" w:color="auto" w:fill="F5F7FB"/>
-          </w:tcPr>
+          <w:tcPr/>
           <w:p>
             <w:pPr>
               <w:pStyle w:val="Compact"/>
@@ -6824,9 +6903,7 @@
           </w:p>
         </w:tc>
         <w:tc>
-          <w:tcPr>
-            <w:shd w:val="clear" w:color="auto" w:fill="F5F7FB"/>
-          </w:tcPr>
+          <w:tcPr/>
           <w:p>
             <w:pPr>
               <w:pStyle w:val="Compact"/>
@@ -8929,55 +9006,55 @@
               <w:rPr>
                 <w:sz w:val="17"/>
               </w:rPr>
-              <w:t xml:space="preserve">Almuerzo (40 %)</w:t>
-            </w:r>
-          </w:p>
-        </w:tc>
-        <w:tc>
-          <w:tcPr/>
-          <w:p>
-            <w:pPr>
-              <w:pStyle w:val="Compact"/>
-              <w:spacing w:after="0" w:before="0" w:line="240" w:lineRule="auto"/>
-              <w:jc w:val="right"/>
-            </w:pPr>
-            <w:r>
-              <w:rPr>
-                <w:sz w:val="17"/>
-              </w:rPr>
-              <w:t xml:space="preserve">31</w:t>
-            </w:r>
-          </w:p>
-        </w:tc>
-        <w:tc>
-          <w:tcPr/>
-          <w:p>
-            <w:pPr>
-              <w:pStyle w:val="Compact"/>
-              <w:spacing w:after="0" w:before="0" w:line="240" w:lineRule="auto"/>
-              <w:jc w:val="right"/>
-            </w:pPr>
-            <w:r>
-              <w:rPr>
-                <w:sz w:val="17"/>
-              </w:rPr>
-              <w:t xml:space="preserve">17</w:t>
-            </w:r>
-          </w:p>
-        </w:tc>
-        <w:tc>
-          <w:tcPr/>
-          <w:p>
-            <w:pPr>
-              <w:pStyle w:val="Compact"/>
-              <w:spacing w:after="0" w:before="0" w:line="240" w:lineRule="auto"/>
-              <w:jc w:val="right"/>
-            </w:pPr>
-            <w:r>
-              <w:rPr>
-                <w:sz w:val="17"/>
-              </w:rPr>
-              <w:t xml:space="preserve">11</w:t>
+              <w:t xml:space="preserve">Almuerzo 12:00 m. - 3:00 p. m. (43 %)</w:t>
+            </w:r>
+          </w:p>
+        </w:tc>
+        <w:tc>
+          <w:tcPr/>
+          <w:p>
+            <w:pPr>
+              <w:pStyle w:val="Compact"/>
+              <w:spacing w:after="0" w:before="0" w:line="240" w:lineRule="auto"/>
+              <w:jc w:val="right"/>
+            </w:pPr>
+            <w:r>
+              <w:rPr>
+                <w:sz w:val="17"/>
+              </w:rPr>
+              <w:t xml:space="preserve">34</w:t>
+            </w:r>
+          </w:p>
+        </w:tc>
+        <w:tc>
+          <w:tcPr/>
+          <w:p>
+            <w:pPr>
+              <w:pStyle w:val="Compact"/>
+              <w:spacing w:after="0" w:before="0" w:line="240" w:lineRule="auto"/>
+              <w:jc w:val="right"/>
+            </w:pPr>
+            <w:r>
+              <w:rPr>
+                <w:sz w:val="17"/>
+              </w:rPr>
+              <w:t xml:space="preserve">18</w:t>
+            </w:r>
+          </w:p>
+        </w:tc>
+        <w:tc>
+          <w:tcPr/>
+          <w:p>
+            <w:pPr>
+              <w:pStyle w:val="Compact"/>
+              <w:spacing w:after="0" w:before="0" w:line="240" w:lineRule="auto"/>
+              <w:jc w:val="right"/>
+            </w:pPr>
+            <w:r>
+              <w:rPr>
+                <w:sz w:val="17"/>
+              </w:rPr>
+              <w:t xml:space="preserve">12</w:t>
             </w:r>
           </w:p>
         </w:tc>
@@ -9016,79 +9093,79 @@
               <w:rPr>
                 <w:sz w:val="17"/>
               </w:rPr>
-              <w:t xml:space="preserve">Cena (60 %)</w:t>
-            </w:r>
-          </w:p>
-        </w:tc>
-        <w:tc>
-          <w:tcPr>
-            <w:shd w:val="clear" w:color="auto" w:fill="F5F7FB"/>
-          </w:tcPr>
-          <w:p>
-            <w:pPr>
-              <w:pStyle w:val="Compact"/>
-              <w:spacing w:after="0" w:before="0" w:line="240" w:lineRule="auto"/>
-              <w:jc w:val="right"/>
-            </w:pPr>
-            <w:r>
-              <w:rPr>
-                <w:sz w:val="17"/>
-              </w:rPr>
-              <w:t xml:space="preserve">47</w:t>
-            </w:r>
-          </w:p>
-        </w:tc>
-        <w:tc>
-          <w:tcPr>
-            <w:shd w:val="clear" w:color="auto" w:fill="F5F7FB"/>
-          </w:tcPr>
-          <w:p>
-            <w:pPr>
-              <w:pStyle w:val="Compact"/>
-              <w:spacing w:after="0" w:before="0" w:line="240" w:lineRule="auto"/>
-              <w:jc w:val="right"/>
-            </w:pPr>
-            <w:r>
-              <w:rPr>
-                <w:sz w:val="17"/>
-              </w:rPr>
-              <w:t xml:space="preserve">25</w:t>
-            </w:r>
-          </w:p>
-        </w:tc>
-        <w:tc>
-          <w:tcPr>
-            <w:shd w:val="clear" w:color="auto" w:fill="F5F7FB"/>
-          </w:tcPr>
-          <w:p>
-            <w:pPr>
-              <w:pStyle w:val="Compact"/>
-              <w:spacing w:after="0" w:before="0" w:line="240" w:lineRule="auto"/>
-              <w:jc w:val="right"/>
-            </w:pPr>
-            <w:r>
-              <w:rPr>
-                <w:sz w:val="17"/>
-              </w:rPr>
-              <w:t xml:space="preserve">17</w:t>
-            </w:r>
-          </w:p>
-        </w:tc>
-        <w:tc>
-          <w:tcPr>
-            <w:shd w:val="clear" w:color="auto" w:fill="F5F7FB"/>
-          </w:tcPr>
-          <w:p>
-            <w:pPr>
-              <w:pStyle w:val="Compact"/>
-              <w:spacing w:after="0" w:before="0" w:line="240" w:lineRule="auto"/>
-              <w:jc w:val="right"/>
-            </w:pPr>
-            <w:r>
-              <w:rPr>
-                <w:sz w:val="17"/>
-              </w:rPr>
-              <w:t xml:space="preserve">15</w:t>
+              <w:t xml:space="preserve">Tarde 3:00 p. m. - 6:00 p. m. (14 %)</w:t>
+            </w:r>
+          </w:p>
+        </w:tc>
+        <w:tc>
+          <w:tcPr>
+            <w:shd w:val="clear" w:color="auto" w:fill="F5F7FB"/>
+          </w:tcPr>
+          <w:p>
+            <w:pPr>
+              <w:pStyle w:val="Compact"/>
+              <w:spacing w:after="0" w:before="0" w:line="240" w:lineRule="auto"/>
+              <w:jc w:val="right"/>
+            </w:pPr>
+            <w:r>
+              <w:rPr>
+                <w:sz w:val="17"/>
+              </w:rPr>
+              <w:t xml:space="preserve">11</w:t>
+            </w:r>
+          </w:p>
+        </w:tc>
+        <w:tc>
+          <w:tcPr>
+            <w:shd w:val="clear" w:color="auto" w:fill="F5F7FB"/>
+          </w:tcPr>
+          <w:p>
+            <w:pPr>
+              <w:pStyle w:val="Compact"/>
+              <w:spacing w:after="0" w:before="0" w:line="240" w:lineRule="auto"/>
+              <w:jc w:val="right"/>
+            </w:pPr>
+            <w:r>
+              <w:rPr>
+                <w:sz w:val="17"/>
+              </w:rPr>
+              <w:t xml:space="preserve">6</w:t>
+            </w:r>
+          </w:p>
+        </w:tc>
+        <w:tc>
+          <w:tcPr>
+            <w:shd w:val="clear" w:color="auto" w:fill="F5F7FB"/>
+          </w:tcPr>
+          <w:p>
+            <w:pPr>
+              <w:pStyle w:val="Compact"/>
+              <w:spacing w:after="0" w:before="0" w:line="240" w:lineRule="auto"/>
+              <w:jc w:val="right"/>
+            </w:pPr>
+            <w:r>
+              <w:rPr>
+                <w:sz w:val="17"/>
+              </w:rPr>
+              <w:t xml:space="preserve">4</w:t>
+            </w:r>
+          </w:p>
+        </w:tc>
+        <w:tc>
+          <w:tcPr>
+            <w:shd w:val="clear" w:color="auto" w:fill="F5F7FB"/>
+          </w:tcPr>
+          <w:p>
+            <w:pPr>
+              <w:pStyle w:val="Compact"/>
+              <w:spacing w:after="0" w:before="0" w:line="240" w:lineRule="auto"/>
+              <w:jc w:val="right"/>
+            </w:pPr>
+            <w:r>
+              <w:rPr>
+                <w:sz w:val="17"/>
+              </w:rPr>
+              <w:t xml:space="preserve">3</w:t>
             </w:r>
           </w:p>
         </w:tc>
@@ -9107,6 +9184,93 @@
             </w:pPr>
             <w:r>
               <w:rPr>
+                <w:sz w:val="17"/>
+              </w:rPr>
+              <w:t xml:space="preserve">Noche 6:00 p. m. - 10:00 p. m. (43 %)</w:t>
+            </w:r>
+          </w:p>
+        </w:tc>
+        <w:tc>
+          <w:tcPr/>
+          <w:p>
+            <w:pPr>
+              <w:pStyle w:val="Compact"/>
+              <w:spacing w:after="0" w:before="0" w:line="240" w:lineRule="auto"/>
+              <w:jc w:val="right"/>
+            </w:pPr>
+            <w:r>
+              <w:rPr>
+                <w:sz w:val="17"/>
+              </w:rPr>
+              <w:t xml:space="preserve">34</w:t>
+            </w:r>
+          </w:p>
+        </w:tc>
+        <w:tc>
+          <w:tcPr/>
+          <w:p>
+            <w:pPr>
+              <w:pStyle w:val="Compact"/>
+              <w:spacing w:after="0" w:before="0" w:line="240" w:lineRule="auto"/>
+              <w:jc w:val="right"/>
+            </w:pPr>
+            <w:r>
+              <w:rPr>
+                <w:sz w:val="17"/>
+              </w:rPr>
+              <w:t xml:space="preserve">18</w:t>
+            </w:r>
+          </w:p>
+        </w:tc>
+        <w:tc>
+          <w:tcPr/>
+          <w:p>
+            <w:pPr>
+              <w:pStyle w:val="Compact"/>
+              <w:spacing w:after="0" w:before="0" w:line="240" w:lineRule="auto"/>
+              <w:jc w:val="right"/>
+            </w:pPr>
+            <w:r>
+              <w:rPr>
+                <w:sz w:val="17"/>
+              </w:rPr>
+              <w:t xml:space="preserve">12</w:t>
+            </w:r>
+          </w:p>
+        </w:tc>
+        <w:tc>
+          <w:tcPr/>
+          <w:p>
+            <w:pPr>
+              <w:pStyle w:val="Compact"/>
+              <w:spacing w:after="0" w:before="0" w:line="240" w:lineRule="auto"/>
+              <w:jc w:val="right"/>
+            </w:pPr>
+            <w:r>
+              <w:rPr>
+                <w:sz w:val="17"/>
+              </w:rPr>
+              <w:t xml:space="preserve">10</w:t>
+            </w:r>
+          </w:p>
+        </w:tc>
+      </w:tr>
+      <w:tr>
+        <w:trPr>
+          <w:cantSplit/>
+        </w:trPr>
+        <w:tc>
+          <w:tcPr>
+            <w:shd w:val="clear" w:color="auto" w:fill="F5F7FB"/>
+          </w:tcPr>
+          <w:p>
+            <w:pPr>
+              <w:pStyle w:val="Compact"/>
+              <w:spacing w:after="0" w:before="0" w:line="240" w:lineRule="auto"/>
+              <w:jc w:val="left"/>
+            </w:pPr>
+            <w:r>
+              <w:rPr>
                 <w:bCs/>
                 <w:b/>
                 <w:sz w:val="17"/>
@@ -9116,7 +9280,9 @@
           </w:p>
         </w:tc>
         <w:tc>
-          <w:tcPr/>
+          <w:tcPr>
+            <w:shd w:val="clear" w:color="auto" w:fill="F5F7FB"/>
+          </w:tcPr>
           <w:p>
             <w:pPr>
               <w:pStyle w:val="Compact"/>
@@ -9134,7 +9300,9 @@
           </w:p>
         </w:tc>
         <w:tc>
-          <w:tcPr/>
+          <w:tcPr>
+            <w:shd w:val="clear" w:color="auto" w:fill="F5F7FB"/>
+          </w:tcPr>
           <w:p>
             <w:pPr>
               <w:pStyle w:val="Compact"/>
@@ -9152,7 +9320,9 @@
           </w:p>
         </w:tc>
         <w:tc>
-          <w:tcPr/>
+          <w:tcPr>
+            <w:shd w:val="clear" w:color="auto" w:fill="F5F7FB"/>
+          </w:tcPr>
           <w:p>
             <w:pPr>
               <w:pStyle w:val="Compact"/>
@@ -9170,7 +9340,9 @@
           </w:p>
         </w:tc>
         <w:tc>
-          <w:tcPr/>
+          <w:tcPr>
+            <w:shd w:val="clear" w:color="auto" w:fill="F5F7FB"/>
+          </w:tcPr>
           <w:p>
             <w:pPr>
               <w:pStyle w:val="Compact"/>
@@ -9263,6 +9435,14 @@
       </w:pPr>
       <w:r>
         <w:t xml:space="preserve">4.1 Proceso productivo de Rollos de sushi</w:t>
+      </w:r>
+    </w:p>
+    <w:p>
+      <w:pPr>
+        <w:pStyle w:val="FirstParagraph"/>
+      </w:pPr>
+      <w:r>
+        <w:t xml:space="preserve">El rollo de sushi es el proceso más delicado de Kazegami porque el pescado se sirve crudo. Por eso empieza con la recepción y la ultracongelación del pargo, sigue con la preparación del arroz (shari) y termina con el armado y corte del rollo al momento del pedido. El diagrama de flujo muestra la secuencia general y el cursograma detalla cada actividad con su tiempo, su responsable y su control.</w:t>
       </w:r>
     </w:p>
     <w:p>
@@ -9535,7 +9715,7 @@
               <w:rPr>
                 <w:sz w:val="17"/>
               </w:rPr>
-              <w:t xml:space="preserve">Recepción del pescado del día (Bazurto / Mercado del Mar)</w:t>
+              <w:t xml:space="preserve">Recepción del pescado (martes y viernes, Bazurto / Mercado del Mar)</w:t>
             </w:r>
           </w:p>
         </w:tc>
@@ -9963,7 +10143,7 @@
               <w:rPr>
                 <w:sz w:val="17"/>
               </w:rPr>
-              <w:t xml:space="preserve">Almacenamiento refrigerado</w:t>
+              <w:t xml:space="preserve">Almacenamiento congelado y descongelado diario en refrigeración</w:t>
             </w:r>
           </w:p>
         </w:tc>
@@ -9995,7 +10175,7 @@
               <w:rPr>
                 <w:sz w:val="17"/>
               </w:rPr>
-              <w:t xml:space="preserve">≤ 48 h</w:t>
+              <w:t xml:space="preserve">≤ 4 días congelado + ≤ 48 h refrigerado</w:t>
             </w:r>
           </w:p>
         </w:tc>
@@ -10027,7 +10207,7 @@
               <w:rPr>
                 <w:sz w:val="17"/>
               </w:rPr>
-              <w:t xml:space="preserve">0-4 °C; rotulado con fecha; PEPS</w:t>
+              <w:t xml:space="preserve">−18 °C; se descongela a 0-4 °C solo lo del día; rotulado con fecha; PEPS</w:t>
             </w:r>
           </w:p>
         </w:tc>
@@ -10669,7 +10849,7 @@
               <w:rPr>
                 <w:sz w:val="17"/>
               </w:rPr>
-              <w:t xml:space="preserve">Guantes o manos lavadas; 120 g de arroz por rollo</w:t>
+              <w:t xml:space="preserve">Guantes o manos lavadas; 150 g de arroz y 56 g de pescado por rollo</w:t>
             </w:r>
           </w:p>
         </w:tc>
@@ -10710,7 +10890,7 @@
               <w:rPr>
                 <w:sz w:val="17"/>
               </w:rPr>
-              <w:t xml:space="preserve">Corte en 8 piezas y emplatado</w:t>
+              <w:t xml:space="preserve">Corte en 10 piezas y emplatado</w:t>
             </w:r>
           </w:p>
         </w:tc>
@@ -11010,6 +11190,14 @@
       </w:pPr>
       <w:r>
         <w:t xml:space="preserve">4.2 Proceso productivo de Ramen</w:t>
+      </w:r>
+    </w:p>
+    <w:p>
+      <w:pPr>
+        <w:pStyle w:val="FirstParagraph"/>
+      </w:pPr>
+      <w:r>
+        <w:t xml:space="preserve">El ramen depende de una producción anticipada larga: el caldo se cocina entre 10 y 12 horas y el chashu y el huevo marinado se preparan desde el día anterior. Gracias a eso, al momento del pedido solo se calienta el caldo, se cocina el fideo y se arma el bowl. El diagrama y el cursograma presentan ambas etapas.</w:t>
       </w:r>
     </w:p>
     <w:p>
@@ -12547,6 +12735,14 @@
     </w:p>
     <w:p>
       <w:pPr>
+        <w:pStyle w:val="FirstParagraph"/>
+      </w:pPr>
+      <w:r>
+        <w:t xml:space="preserve">La tempura se prepara casi por completo al momento del pedido para conservar su textura crocante. La producción anticipada se limita a pelar el langostino y cortar los vegetales; el batido, la fritura y el emplatado se hacen cuando llega la comanda, como muestran el diagrama y el cursograma.</w:t>
+      </w:r>
+    </w:p>
+    <w:p>
+      <w:pPr>
         <w:pStyle w:val="CaptionedFigure"/>
         <w:keepNext/>
         <w:jc w:val="center"/>
@@ -14076,6 +14272,14 @@
       </w:pPr>
       <w:r>
         <w:t xml:space="preserve">4.4 Prestación del servicio en sala y barra</w:t>
+      </w:r>
+    </w:p>
+    <w:p>
+      <w:pPr>
+        <w:pStyle w:val="FirstParagraph"/>
+      </w:pPr>
+      <w:r>
+        <w:t xml:space="preserve">La prestación del servicio describe el recorrido del cliente desde que reserva hasta que paga. El diagrama de flujo y el cursograma identifican los pasos de atención y los tiempos de cada uno, y al final se resumen las actividades de los cuatro procesos y los tiempos de entrega al cliente.</w:t>
       </w:r>
     </w:p>
     <w:p>
@@ -14917,7 +15121,7 @@
               <w:rPr>
                 <w:sz w:val="17"/>
               </w:rPr>
-              <w:t xml:space="preserve">8-15 min</w:t>
+              <w:t xml:space="preserve">12-20 min</w:t>
             </w:r>
           </w:p>
         </w:tc>
@@ -14953,7 +15157,7 @@
               <w:rPr>
                 <w:sz w:val="17"/>
               </w:rPr>
-              <w:t xml:space="preserve">Tiempos estándar por plato</w:t>
+              <w:t xml:space="preserve">Tiempos estándar por plato, incluida la cola de pedidos</w:t>
             </w:r>
           </w:p>
         </w:tc>
@@ -16071,7 +16275,14 @@
         </w:tc>
       </w:tr>
     </w:tbl>
-    <w:p/>
+    <w:p>
+      <w:pPr>
+        <w:pStyle w:val="BodyText"/>
+      </w:pPr>
+      <w:r>
+        <w:t xml:space="preserve">Los tiempos de entrega se calcularon sumando las operaciones al pedido de cada cursograma (armado, cocción, emplatado, control y pase) y agregando el tiempo de espera por la cola de comandas en las horas de mayor afluencia. Son un estándar operativo definido por el equipo.</w:t>
+      </w:r>
+    </w:p>
     <w:p>
       <w:pPr>
         <w:pStyle w:val="TableCaption"/>
@@ -16103,10 +16314,10 @@
         </w:tblCellMar>
       </w:tblPr>
       <w:tblGrid>
-        <w:gridCol w:w="1453"/>
-        <w:gridCol w:w="1671"/>
-        <w:gridCol w:w="3124"/>
-        <w:gridCol w:w="1671"/>
+        <w:gridCol w:w="1641"/>
+        <w:gridCol w:w="1641"/>
+        <w:gridCol w:w="2782"/>
+        <w:gridCol w:w="1855"/>
       </w:tblGrid>
       <w:tr>
         <w:trPr>
@@ -16150,7 +16361,7 @@
                 <w:color w:val="1F3A68"/>
                 <w:sz w:val="18"/>
               </w:rPr>
-              <w:t xml:space="preserve">Tiempo de preparación al pedido</w:t>
+              <w:t xml:space="preserve">Tiempo de preparación sin cola</w:t>
             </w:r>
           </w:p>
         </w:tc>
@@ -16190,7 +16401,7 @@
                 <w:color w:val="1F3A68"/>
                 <w:sz w:val="18"/>
               </w:rPr>
-              <w:t xml:space="preserve">Tiempo objetivo pedido → mesa</w:t>
+              <w:t xml:space="preserve">Tiempo objetivo pedido → mesa (con cola)</w:t>
             </w:r>
           </w:p>
         </w:tc>
@@ -16227,7 +16438,7 @@
               <w:rPr>
                 <w:sz w:val="18"/>
               </w:rPr>
-              <w:t xml:space="preserve">6-8 min</w:t>
+              <w:t xml:space="preserve">8-10 min</w:t>
             </w:r>
           </w:p>
         </w:tc>
@@ -16243,7 +16454,7 @@
               <w:rPr>
                 <w:sz w:val="18"/>
               </w:rPr>
-              <w:t xml:space="preserve">Pescado ultracongelado y refrigerado; shari listo</w:t>
+              <w:t xml:space="preserve">Pescado ultracongelado y descongelado; shari listo</w:t>
             </w:r>
           </w:p>
         </w:tc>
@@ -16259,7 +16470,7 @@
               <w:rPr>
                 <w:sz w:val="18"/>
               </w:rPr>
-              <w:t xml:space="preserve">≤ 10 min</w:t>
+              <w:t xml:space="preserve">15-20 min</w:t>
             </w:r>
           </w:p>
         </w:tc>
@@ -16300,7 +16511,7 @@
               <w:rPr>
                 <w:sz w:val="18"/>
               </w:rPr>
-              <w:t xml:space="preserve">4-5 min</w:t>
+              <w:t xml:space="preserve">6-8 min</w:t>
             </w:r>
           </w:p>
         </w:tc>
@@ -16336,7 +16547,7 @@
               <w:rPr>
                 <w:sz w:val="18"/>
               </w:rPr>
-              <w:t xml:space="preserve">≤ 8 min</w:t>
+              <w:t xml:space="preserve">12-15 min</w:t>
             </w:r>
           </w:p>
         </w:tc>
@@ -16373,7 +16584,7 @@
               <w:rPr>
                 <w:sz w:val="18"/>
               </w:rPr>
-              <w:t xml:space="preserve">5-7 min</w:t>
+              <w:t xml:space="preserve">6-8 min</w:t>
             </w:r>
           </w:p>
         </w:tc>
@@ -16405,12 +16616,109 @@
               <w:rPr>
                 <w:sz w:val="18"/>
               </w:rPr>
-              <w:t xml:space="preserve">≤ 8 min</w:t>
+              <w:t xml:space="preserve">12-15 min</w:t>
+            </w:r>
+          </w:p>
+        </w:tc>
+      </w:tr>
+      <w:tr>
+        <w:trPr>
+          <w:cantSplit/>
+        </w:trPr>
+        <w:tc>
+          <w:tcPr>
+            <w:shd w:val="clear" w:color="auto" w:fill="F5F7FB"/>
+          </w:tcPr>
+          <w:p>
+            <w:pPr>
+              <w:pStyle w:val="Compact"/>
+              <w:spacing w:after="0" w:before="0" w:line="240" w:lineRule="auto"/>
+              <w:jc w:val="left"/>
+            </w:pPr>
+            <w:r>
+              <w:rPr>
+                <w:bCs/>
+                <w:b/>
+                <w:sz w:val="18"/>
+              </w:rPr>
+              <w:t xml:space="preserve">Pedido completo de una mesa</w:t>
+            </w:r>
+          </w:p>
+        </w:tc>
+        <w:tc>
+          <w:tcPr>
+            <w:shd w:val="clear" w:color="auto" w:fill="F5F7FB"/>
+          </w:tcPr>
+          <w:p>
+            <w:pPr>
+              <w:pStyle w:val="Compact"/>
+              <w:spacing w:after="0" w:before="0" w:line="240" w:lineRule="auto"/>
+              <w:jc w:val="left"/>
+            </w:pPr>
+            <w:r>
+              <w:rPr>
+                <w:sz w:val="18"/>
+              </w:rPr>
+              <w:t xml:space="preserve">—</w:t>
+            </w:r>
+          </w:p>
+        </w:tc>
+        <w:tc>
+          <w:tcPr>
+            <w:shd w:val="clear" w:color="auto" w:fill="F5F7FB"/>
+          </w:tcPr>
+          <w:p>
+            <w:pPr>
+              <w:pStyle w:val="Compact"/>
+              <w:spacing w:after="0" w:before="0" w:line="240" w:lineRule="auto"/>
+              <w:jc w:val="left"/>
+            </w:pPr>
+            <w:r>
+              <w:rPr>
+                <w:sz w:val="18"/>
+              </w:rPr>
+              <w:t xml:space="preserve">Los platos de una misma mesa salen juntos</w:t>
+            </w:r>
+          </w:p>
+        </w:tc>
+        <w:tc>
+          <w:tcPr>
+            <w:shd w:val="clear" w:color="auto" w:fill="F5F7FB"/>
+          </w:tcPr>
+          <w:p>
+            <w:pPr>
+              <w:pStyle w:val="Compact"/>
+              <w:spacing w:after="0" w:before="0" w:line="240" w:lineRule="auto"/>
+              <w:jc w:val="left"/>
+            </w:pPr>
+            <w:r>
+              <w:rPr>
+                <w:bCs/>
+                <w:b/>
+                <w:sz w:val="18"/>
+              </w:rPr>
+              <w:t xml:space="preserve">≤ 20 min (≤ 25 min en hora pico)</w:t>
             </w:r>
           </w:p>
         </w:tc>
       </w:tr>
     </w:tbl>
+    <w:p>
+      <w:pPr>
+        <w:pStyle w:val="BodyText"/>
+        <w:spacing w:after="160"/>
+        <w:jc w:val="left"/>
+      </w:pPr>
+      <w:r>
+        <w:rPr>
+          <w:iCs/>
+          <w:i/>
+          <w:color w:val="52514E"/>
+          <w:sz w:val="16"/>
+        </w:rPr>
+        <w:t xml:space="preserve">Fuente: Estándar operativo del equipo con base en los cursogramas.</w:t>
+      </w:r>
+    </w:p>
     <w:bookmarkEnd w:id="57"/>
     <w:bookmarkStart w:id="58" w:name="puntos-críticos-de-control-inocuidad"/>
     <w:p>
@@ -16419,6 +16727,14 @@
       </w:pPr>
       <w:r>
         <w:t xml:space="preserve">4.5 Puntos críticos de control (inocuidad)</w:t>
+      </w:r>
+    </w:p>
+    <w:p>
+      <w:pPr>
+        <w:pStyle w:val="FirstParagraph"/>
+      </w:pPr>
+      <w:r>
+        <w:t xml:space="preserve">Los puntos críticos de control son las etapas del proceso donde un error puede poner en riesgo la salud del cliente. Siguiendo el enfoque HACCP, la tabla identifica cinco puntos críticos de los tres platos, el peligro asociado, el límite que no se debe superar, cómo se vigila y qué se hace si falla.</w:t>
       </w:r>
     </w:p>
     <w:p>
@@ -17035,6 +17351,14 @@
       </w:pPr>
       <w:r>
         <w:t xml:space="preserve">4.6 Distribución de áreas del local (layout)</w:t>
+      </w:r>
+    </w:p>
+    <w:p>
+      <w:pPr>
+        <w:pStyle w:val="FirstParagraph"/>
+      </w:pPr>
+      <w:r>
+        <w:t xml:space="preserve">La distribución en planta organiza los 200 m² del local para que los insumos avancen en una sola dirección —de la recepción al almacenamiento, la preparación, la cocción y el servicio— sin cruzarse con la vajilla sucia ni con los residuos. La figura muestra el plano general y la tabla detalla el área, la función y los equipos de cada zona.</w:t>
       </w:r>
     </w:p>
     <w:p>
@@ -19027,7 +19351,7 @@
               <w:rPr>
                 <w:sz w:val="17"/>
               </w:rPr>
-              <w:t xml:space="preserve">395,0 kg</w:t>
+              <w:t xml:space="preserve">500,3 kg</w:t>
             </w:r>
           </w:p>
         </w:tc>
@@ -19098,7 +19422,7 @@
               <w:rPr>
                 <w:sz w:val="17"/>
               </w:rPr>
-              <w:t xml:space="preserve">Berenjena</w:t>
+              <w:t xml:space="preserve">Pepino cohombro</w:t>
             </w:r>
           </w:p>
         </w:tc>
@@ -19134,7 +19458,7 @@
               <w:rPr>
                 <w:sz w:val="17"/>
               </w:rPr>
-              <w:t xml:space="preserve">264,4 kg</w:t>
+              <w:t xml:space="preserve">329,1 kg</w:t>
             </w:r>
           </w:p>
         </w:tc>
@@ -19170,7 +19494,7 @@
               <w:rPr>
                 <w:sz w:val="17"/>
               </w:rPr>
-              <w:t xml:space="preserve">Mercado local / nacional</w:t>
+              <w:t xml:space="preserve">Todo el año</w:t>
             </w:r>
           </w:p>
         </w:tc>
@@ -19209,7 +19533,7 @@
               <w:rPr>
                 <w:sz w:val="17"/>
               </w:rPr>
-              <w:t xml:space="preserve">Ahuyama</w:t>
+              <w:t xml:space="preserve">Berenjena</w:t>
             </w:r>
           </w:p>
         </w:tc>
@@ -19312,7 +19636,7 @@
               <w:rPr>
                 <w:sz w:val="17"/>
               </w:rPr>
-              <w:t xml:space="preserve">Pepino cohombro</w:t>
+              <w:t xml:space="preserve">Ahuyama</w:t>
             </w:r>
           </w:p>
         </w:tc>
@@ -19348,7 +19672,7 @@
               <w:rPr>
                 <w:sz w:val="17"/>
               </w:rPr>
-              <w:t xml:space="preserve">263,3 kg</w:t>
+              <w:t xml:space="preserve">264,4 kg</w:t>
             </w:r>
           </w:p>
         </w:tc>
@@ -19384,7 +19708,7 @@
               <w:rPr>
                 <w:sz w:val="17"/>
               </w:rPr>
-              <w:t xml:space="preserve">Todo el año</w:t>
+              <w:t xml:space="preserve">Mercado local / nacional</w:t>
             </w:r>
           </w:p>
         </w:tc>
@@ -19526,7 +19850,7 @@
               <w:rPr>
                 <w:sz w:val="17"/>
               </w:rPr>
-              <w:t xml:space="preserve">Cebolla cabezona blanca</w:t>
+              <w:t xml:space="preserve">Mango de azúcar</w:t>
             </w:r>
           </w:p>
         </w:tc>
@@ -19562,61 +19886,61 @@
               <w:rPr>
                 <w:sz w:val="17"/>
               </w:rPr>
-              <w:t xml:space="preserve">226,6 kg</w:t>
-            </w:r>
-          </w:p>
-        </w:tc>
-        <w:tc>
-          <w:tcPr>
-            <w:shd w:val="clear" w:color="auto" w:fill="F5F7FB"/>
-          </w:tcPr>
-          <w:p>
-            <w:pPr>
-              <w:pStyle w:val="Compact"/>
-              <w:spacing w:after="0" w:before="0" w:line="240" w:lineRule="auto"/>
-              <w:jc w:val="left"/>
-            </w:pPr>
-            <w:r>
-              <w:rPr>
-                <w:sz w:val="17"/>
-              </w:rPr>
-              <w:t xml:space="preserve">Alta</w:t>
-            </w:r>
-          </w:p>
-        </w:tc>
-        <w:tc>
-          <w:tcPr>
-            <w:shd w:val="clear" w:color="auto" w:fill="F5F7FB"/>
-          </w:tcPr>
-          <w:p>
-            <w:pPr>
-              <w:pStyle w:val="Compact"/>
-              <w:spacing w:after="0" w:before="0" w:line="240" w:lineRule="auto"/>
-              <w:jc w:val="left"/>
-            </w:pPr>
-            <w:r>
-              <w:rPr>
-                <w:sz w:val="17"/>
-              </w:rPr>
-              <w:t xml:space="preserve">Mercado local / nacional</w:t>
-            </w:r>
-          </w:p>
-        </w:tc>
-        <w:tc>
-          <w:tcPr>
-            <w:shd w:val="clear" w:color="auto" w:fill="F5F7FB"/>
-          </w:tcPr>
-          <w:p>
-            <w:pPr>
-              <w:pStyle w:val="Compact"/>
-              <w:spacing w:after="0" w:before="0" w:line="240" w:lineRule="auto"/>
-              <w:jc w:val="left"/>
-            </w:pPr>
-            <w:r>
-              <w:rPr>
-                <w:sz w:val="17"/>
-              </w:rPr>
-              <w:t xml:space="preserve">—</w:t>
+              <w:t xml:space="preserve">250,1 kg</w:t>
+            </w:r>
+          </w:p>
+        </w:tc>
+        <w:tc>
+          <w:tcPr>
+            <w:shd w:val="clear" w:color="auto" w:fill="F5F7FB"/>
+          </w:tcPr>
+          <w:p>
+            <w:pPr>
+              <w:pStyle w:val="Compact"/>
+              <w:spacing w:after="0" w:before="0" w:line="240" w:lineRule="auto"/>
+              <w:jc w:val="left"/>
+            </w:pPr>
+            <w:r>
+              <w:rPr>
+                <w:sz w:val="17"/>
+              </w:rPr>
+              <w:t xml:space="preserve">Media</w:t>
+            </w:r>
+          </w:p>
+        </w:tc>
+        <w:tc>
+          <w:tcPr>
+            <w:shd w:val="clear" w:color="auto" w:fill="F5F7FB"/>
+          </w:tcPr>
+          <w:p>
+            <w:pPr>
+              <w:pStyle w:val="Compact"/>
+              <w:spacing w:after="0" w:before="0" w:line="240" w:lineRule="auto"/>
+              <w:jc w:val="left"/>
+            </w:pPr>
+            <w:r>
+              <w:rPr>
+                <w:sz w:val="17"/>
+              </w:rPr>
+              <w:t xml:space="preserve">Fruta de temporada</w:t>
+            </w:r>
+          </w:p>
+        </w:tc>
+        <w:tc>
+          <w:tcPr>
+            <w:shd w:val="clear" w:color="auto" w:fill="F5F7FB"/>
+          </w:tcPr>
+          <w:p>
+            <w:pPr>
+              <w:pStyle w:val="Compact"/>
+              <w:spacing w:after="0" w:before="0" w:line="240" w:lineRule="auto"/>
+              <w:jc w:val="left"/>
+            </w:pPr>
+            <w:r>
+              <w:rPr>
+                <w:sz w:val="17"/>
+              </w:rPr>
+              <w:t xml:space="preserve">Mango Tommy</w:t>
             </w:r>
           </w:p>
         </w:tc>
@@ -19637,7 +19961,7 @@
               <w:rPr>
                 <w:sz w:val="17"/>
               </w:rPr>
-              <w:t xml:space="preserve">Mango de azúcar</w:t>
+              <w:t xml:space="preserve">Cebolla cabezona blanca</w:t>
             </w:r>
           </w:p>
         </w:tc>
@@ -19669,55 +19993,55 @@
               <w:rPr>
                 <w:sz w:val="17"/>
               </w:rPr>
-              <w:t xml:space="preserve">197,5 kg</w:t>
-            </w:r>
-          </w:p>
-        </w:tc>
-        <w:tc>
-          <w:tcPr/>
-          <w:p>
-            <w:pPr>
-              <w:pStyle w:val="Compact"/>
-              <w:spacing w:after="0" w:before="0" w:line="240" w:lineRule="auto"/>
-              <w:jc w:val="left"/>
-            </w:pPr>
-            <w:r>
-              <w:rPr>
-                <w:sz w:val="17"/>
-              </w:rPr>
-              <w:t xml:space="preserve">Media</w:t>
-            </w:r>
-          </w:p>
-        </w:tc>
-        <w:tc>
-          <w:tcPr/>
-          <w:p>
-            <w:pPr>
-              <w:pStyle w:val="Compact"/>
-              <w:spacing w:after="0" w:before="0" w:line="240" w:lineRule="auto"/>
-              <w:jc w:val="left"/>
-            </w:pPr>
-            <w:r>
-              <w:rPr>
-                <w:sz w:val="17"/>
-              </w:rPr>
-              <w:t xml:space="preserve">Fruta de temporada</w:t>
-            </w:r>
-          </w:p>
-        </w:tc>
-        <w:tc>
-          <w:tcPr/>
-          <w:p>
-            <w:pPr>
-              <w:pStyle w:val="Compact"/>
-              <w:spacing w:after="0" w:before="0" w:line="240" w:lineRule="auto"/>
-              <w:jc w:val="left"/>
-            </w:pPr>
-            <w:r>
-              <w:rPr>
-                <w:sz w:val="17"/>
-              </w:rPr>
-              <w:t xml:space="preserve">Mango Tommy</w:t>
+              <w:t xml:space="preserve">226,6 kg</w:t>
+            </w:r>
+          </w:p>
+        </w:tc>
+        <w:tc>
+          <w:tcPr/>
+          <w:p>
+            <w:pPr>
+              <w:pStyle w:val="Compact"/>
+              <w:spacing w:after="0" w:before="0" w:line="240" w:lineRule="auto"/>
+              <w:jc w:val="left"/>
+            </w:pPr>
+            <w:r>
+              <w:rPr>
+                <w:sz w:val="17"/>
+              </w:rPr>
+              <w:t xml:space="preserve">Alta</w:t>
+            </w:r>
+          </w:p>
+        </w:tc>
+        <w:tc>
+          <w:tcPr/>
+          <w:p>
+            <w:pPr>
+              <w:pStyle w:val="Compact"/>
+              <w:spacing w:after="0" w:before="0" w:line="240" w:lineRule="auto"/>
+              <w:jc w:val="left"/>
+            </w:pPr>
+            <w:r>
+              <w:rPr>
+                <w:sz w:val="17"/>
+              </w:rPr>
+              <w:t xml:space="preserve">Mercado local / nacional</w:t>
+            </w:r>
+          </w:p>
+        </w:tc>
+        <w:tc>
+          <w:tcPr/>
+          <w:p>
+            <w:pPr>
+              <w:pStyle w:val="Compact"/>
+              <w:spacing w:after="0" w:before="0" w:line="240" w:lineRule="auto"/>
+              <w:jc w:val="left"/>
+            </w:pPr>
+            <w:r>
+              <w:rPr>
+                <w:sz w:val="17"/>
+              </w:rPr>
+              <w:t xml:space="preserve">—</w:t>
             </w:r>
           </w:p>
         </w:tc>
@@ -20097,7 +20421,7 @@
               <w:rPr>
                 <w:sz w:val="17"/>
               </w:rPr>
-              <w:t xml:space="preserve">1.287,9 kg</w:t>
+              <w:t xml:space="preserve">1.602,8 kg</w:t>
             </w:r>
           </w:p>
         </w:tc>
@@ -20311,7 +20635,7 @@
               <w:rPr>
                 <w:sz w:val="17"/>
               </w:rPr>
-              <w:t xml:space="preserve">1.579,9 kg</w:t>
+              <w:t xml:space="preserve">1.974,8 kg</w:t>
             </w:r>
           </w:p>
         </w:tc>
@@ -20739,7 +21063,7 @@
               <w:rPr>
                 <w:sz w:val="17"/>
               </w:rPr>
-              <w:t xml:space="preserve">197,5 L</w:t>
+              <w:t xml:space="preserve">250,1 L</w:t>
             </w:r>
           </w:p>
         </w:tc>
@@ -21488,7 +21812,7 @@
               <w:rPr>
                 <w:sz w:val="17"/>
               </w:rPr>
-              <w:t xml:space="preserve">1.235,6 kg</w:t>
+              <w:t xml:space="preserve">1.314,6 kg</w:t>
             </w:r>
           </w:p>
         </w:tc>
@@ -21702,7 +22026,7 @@
               <w:rPr>
                 <w:sz w:val="17"/>
               </w:rPr>
-              <w:t xml:space="preserve">263,3 kg</w:t>
+              <w:t xml:space="preserve">329,1 kg</w:t>
             </w:r>
           </w:p>
         </w:tc>
@@ -21809,7 +22133,7 @@
               <w:rPr>
                 <w:sz w:val="17"/>
               </w:rPr>
-              <w:t xml:space="preserve">131,7 kg</w:t>
+              <w:t xml:space="preserve">158,0 kg</w:t>
             </w:r>
           </w:p>
         </w:tc>
@@ -22023,7 +22347,7 @@
               <w:rPr>
                 <w:sz w:val="17"/>
               </w:rPr>
-              <w:t xml:space="preserve">65,8 kg</w:t>
+              <w:t xml:space="preserve">79,0 kg</w:t>
             </w:r>
           </w:p>
         </w:tc>
@@ -22130,7 +22454,7 @@
               <w:rPr>
                 <w:sz w:val="17"/>
               </w:rPr>
-              <w:t xml:space="preserve">39,5 kg</w:t>
+              <w:t xml:space="preserve">52,7 kg</w:t>
             </w:r>
           </w:p>
         </w:tc>
@@ -22405,7 +22729,7 @@
           <w:bCs/>
           <w:b/>
         </w:rPr>
-        <w:t xml:space="preserve">23 %</w:t>
+        <w:t xml:space="preserve">24 %</w:t>
       </w:r>
       <w:r>
         <w:t xml:space="preserve"> </w:t>
@@ -22426,7 +22750,7 @@
         <w:t xml:space="preserve">”</w:t>
       </w:r>
       <w:r>
-        <w:t xml:space="preserve">. Los insumos japoneses importados (45 % del costo) son de baja perecibilidad, por lo que se compran cada mes y se mantiene un stock de seguridad de 30 días para cubrir retrasos.</w:t>
+        <w:t xml:space="preserve">. Los insumos japoneses importados (44 % del costo) son de baja perecibilidad, por lo que se compran cada mes y se mantiene un stock de seguridad de 30 días para cubrir retrasos.</w:t>
       </w:r>
     </w:p>
     <w:p>
@@ -22922,6 +23246,14 @@
       </w:pPr>
       <w:r>
         <w:t xml:space="preserve">5.2 Ficha técnica de maquinaria y equipos</w:t>
+      </w:r>
+    </w:p>
+    <w:p>
+      <w:pPr>
+        <w:pStyle w:val="FirstParagraph"/>
+      </w:pPr>
+      <w:r>
+        <w:t xml:space="preserve">La ficha técnica describe los equipos necesarios para producir los tres platos: su especificación, la cantidad, el área donde se ubican, la función que cumplen y su vida útil. Los equipos de refrigeración y ultracongelación son los más importantes, porque garantizan la inocuidad del pescado crudo.</w:t>
       </w:r>
     </w:p>
     <w:p>
@@ -25686,6 +26018,14 @@
     </w:p>
     <w:p>
       <w:pPr>
+        <w:pStyle w:val="FirstParagraph"/>
+      </w:pPr>
+      <w:r>
+        <w:t xml:space="preserve">Además de los equipos de cocina, Kazegami necesita tecnología de información para tomar pedidos, facturar, controlar el inventario y registrar las temperaturas. La tabla presenta cada componente, la solución elegida, su función y proveedores de referencia en Colombia.</w:t>
+      </w:r>
+    </w:p>
+    <w:p>
+      <w:pPr>
         <w:pStyle w:val="TableCaption"/>
       </w:pPr>
       <w:r>
@@ -26323,6 +26663,14 @@
       </w:pPr>
       <w:r>
         <w:t xml:space="preserve">5.4 Personal requerido</w:t>
+      </w:r>
+    </w:p>
+    <w:p>
+      <w:pPr>
+        <w:pStyle w:val="FirstParagraph"/>
+      </w:pPr>
+      <w:r>
+        <w:t xml:space="preserve">El personal se dimensionó para operar la capacidad instalada durante el horario continuo de 12:00 m. a 10:00 p. m., con dos sushimen en la barra para las horas pico. La tabla presenta los cargos, el salario base de cada uno, su costo mensual con prestaciones sociales y la fuente del salario.</w:t>
       </w:r>
     </w:p>
     <w:p>
@@ -27882,7 +28230,7 @@
               <w:rPr>
                 <w:sz w:val="18"/>
               </w:rPr>
-              <w:t xml:space="preserve">$10.900.953</w:t>
+              <w:t xml:space="preserve">$12.911.146</w:t>
             </w:r>
           </w:p>
         </w:tc>
@@ -27994,7 +28342,7 @@
               <w:rPr>
                 <w:sz w:val="18"/>
               </w:rPr>
-              <w:t xml:space="preserve">$10.900.953 ÷ 1.097 = $9.936</w:t>
+              <w:t xml:space="preserve">$12.911.146 ÷ 1.097 = $11.768</w:t>
             </w:r>
           </w:p>
         </w:tc>
@@ -28032,6 +28380,14 @@
       </w:pPr>
       <w:r>
         <w:t xml:space="preserve">6.2 Tabla de insumos y costos para Rollos de sushi</w:t>
+      </w:r>
+    </w:p>
+    <w:p>
+      <w:pPr>
+        <w:pStyle w:val="FirstParagraph"/>
+      </w:pPr>
+      <w:r>
+        <w:t xml:space="preserve">El rollo de sushi se elabora con 16 insumos. La primera tabla presenta la receta estándar por porción, con la cantidad, el precio y la fuente de cada ingrediente; la segunda aplica el formato Punto 6 para llegar al costo unitario del mes.</w:t>
       </w:r>
     </w:p>
     <w:p>
@@ -28210,7 +28566,7 @@
               <w:rPr>
                 <w:sz w:val="17"/>
               </w:rPr>
-              <w:t xml:space="preserve">120 g</w:t>
+              <w:t xml:space="preserve">150 g</w:t>
             </w:r>
           </w:p>
         </w:tc>
@@ -28242,7 +28598,7 @@
               <w:rPr>
                 <w:sz w:val="17"/>
               </w:rPr>
-              <w:t xml:space="preserve">$1.958</w:t>
+              <w:t xml:space="preserve">$2.447</w:t>
             </w:r>
           </w:p>
         </w:tc>
@@ -28299,7 +28655,7 @@
               <w:rPr>
                 <w:sz w:val="17"/>
               </w:rPr>
-              <w:t xml:space="preserve">15 ml</w:t>
+              <w:t xml:space="preserve">19 ml</w:t>
             </w:r>
           </w:p>
         </w:tc>
@@ -28335,7 +28691,7 @@
               <w:rPr>
                 <w:sz w:val="17"/>
               </w:rPr>
-              <w:t xml:space="preserve">$360</w:t>
+              <w:t xml:space="preserve">$456</w:t>
             </w:r>
           </w:p>
         </w:tc>
@@ -28390,7 +28746,7 @@
               <w:rPr>
                 <w:sz w:val="17"/>
               </w:rPr>
-              <w:t xml:space="preserve">5 g</w:t>
+              <w:t xml:space="preserve">6 g</w:t>
             </w:r>
           </w:p>
         </w:tc>
@@ -28422,23 +28778,23 @@
               <w:rPr>
                 <w:sz w:val="17"/>
               </w:rPr>
-              <w:t xml:space="preserve">$19</w:t>
-            </w:r>
-          </w:p>
-        </w:tc>
-        <w:tc>
-          <w:tcPr/>
-          <w:p>
-            <w:pPr>
-              <w:pStyle w:val="Compact"/>
-              <w:spacing w:after="0" w:before="0" w:line="240" w:lineRule="auto"/>
-              <w:jc w:val="left"/>
-            </w:pPr>
-            <w:r>
-              <w:rPr>
-                <w:sz w:val="17"/>
-              </w:rPr>
-              <w:t xml:space="preserve">SIPSA-DANE, Cartagena (Bazurto), 26-oct-2026 (vía Agronegocios)</w:t>
+              <w:t xml:space="preserve">$23</w:t>
+            </w:r>
+          </w:p>
+        </w:tc>
+        <w:tc>
+          <w:tcPr/>
+          <w:p>
+            <w:pPr>
+              <w:pStyle w:val="Compact"/>
+              <w:spacing w:after="0" w:before="0" w:line="240" w:lineRule="auto"/>
+              <w:jc w:val="left"/>
+            </w:pPr>
+            <w:r>
+              <w:rPr>
+                <w:sz w:val="17"/>
+              </w:rPr>
+              <w:t xml:space="preserve">SIPSA-DANE, Cartagena (Bazurto) (vía Agronegocios), consulta 24-oct-2026</w:t>
             </w:r>
           </w:p>
         </w:tc>
@@ -28533,7 +28889,7 @@
               <w:rPr>
                 <w:sz w:val="17"/>
               </w:rPr>
-              <w:t xml:space="preserve">SIPSA-DANE, Cartagena (Bazurto), 26-oct-2026 (vía Agronegocios)</w:t>
+              <w:t xml:space="preserve">SIPSA-DANE, Cartagena (Bazurto) (vía Agronegocios), consulta 24-oct-2026</w:t>
             </w:r>
           </w:p>
         </w:tc>
@@ -28641,25 +28997,25 @@
               <w:rPr>
                 <w:sz w:val="17"/>
               </w:rPr>
-              <w:t xml:space="preserve">Pargo rojo entero fresco (pesca artesanal; 45 g de filete, rinde 46 %)</w:t>
-            </w:r>
-          </w:p>
-        </w:tc>
-        <w:tc>
-          <w:tcPr>
-            <w:shd w:val="clear" w:color="auto" w:fill="F5F7FB"/>
-          </w:tcPr>
-          <w:p>
-            <w:pPr>
-              <w:pStyle w:val="Compact"/>
-              <w:spacing w:after="0" w:before="0" w:line="240" w:lineRule="auto"/>
-              <w:jc w:val="right"/>
-            </w:pPr>
-            <w:r>
-              <w:rPr>
-                <w:sz w:val="17"/>
-              </w:rPr>
-              <w:t xml:space="preserve">98 g</w:t>
+              <w:t xml:space="preserve">Pargo rojo entero fresco (pesca artesanal; 56 g de filete, rinde 46 %)</w:t>
+            </w:r>
+          </w:p>
+        </w:tc>
+        <w:tc>
+          <w:tcPr>
+            <w:shd w:val="clear" w:color="auto" w:fill="F5F7FB"/>
+          </w:tcPr>
+          <w:p>
+            <w:pPr>
+              <w:pStyle w:val="Compact"/>
+              <w:spacing w:after="0" w:before="0" w:line="240" w:lineRule="auto"/>
+              <w:jc w:val="right"/>
+            </w:pPr>
+            <w:r>
+              <w:rPr>
+                <w:sz w:val="17"/>
+              </w:rPr>
+              <w:t xml:space="preserve">122 g</w:t>
             </w:r>
           </w:p>
         </w:tc>
@@ -28695,25 +29051,25 @@
               <w:rPr>
                 <w:sz w:val="17"/>
               </w:rPr>
-              <w:t xml:space="preserve">$2.054</w:t>
-            </w:r>
-          </w:p>
-        </w:tc>
-        <w:tc>
-          <w:tcPr>
-            <w:shd w:val="clear" w:color="auto" w:fill="F5F7FB"/>
-          </w:tcPr>
-          <w:p>
-            <w:pPr>
-              <w:pStyle w:val="Compact"/>
-              <w:spacing w:after="0" w:before="0" w:line="240" w:lineRule="auto"/>
-              <w:jc w:val="left"/>
-            </w:pPr>
-            <w:r>
-              <w:rPr>
-                <w:sz w:val="17"/>
-              </w:rPr>
-              <w:t xml:space="preserve">SIPSA-DANE, Cartagena (Bazurto), 26-oct-2026 (vía Agronegocios)</w:t>
+              <w:t xml:space="preserve">$2.557</w:t>
+            </w:r>
+          </w:p>
+        </w:tc>
+        <w:tc>
+          <w:tcPr>
+            <w:shd w:val="clear" w:color="auto" w:fill="F5F7FB"/>
+          </w:tcPr>
+          <w:p>
+            <w:pPr>
+              <w:pStyle w:val="Compact"/>
+              <w:spacing w:after="0" w:before="0" w:line="240" w:lineRule="auto"/>
+              <w:jc w:val="left"/>
+            </w:pPr>
+            <w:r>
+              <w:rPr>
+                <w:sz w:val="17"/>
+              </w:rPr>
+              <w:t xml:space="preserve">SIPSA-DANE, Cartagena (Bazurto) (vía Agronegocios), consulta 24-oct-2026</w:t>
             </w:r>
           </w:p>
         </w:tc>
@@ -28750,7 +29106,7 @@
               <w:rPr>
                 <w:sz w:val="17"/>
               </w:rPr>
-              <w:t xml:space="preserve">25 g</w:t>
+              <w:t xml:space="preserve">31 g</w:t>
             </w:r>
           </w:p>
         </w:tc>
@@ -28782,23 +29138,23 @@
               <w:rPr>
                 <w:sz w:val="17"/>
               </w:rPr>
-              <w:t xml:space="preserve">$1.561</w:t>
-            </w:r>
-          </w:p>
-        </w:tc>
-        <w:tc>
-          <w:tcPr/>
-          <w:p>
-            <w:pPr>
-              <w:pStyle w:val="Compact"/>
-              <w:spacing w:after="0" w:before="0" w:line="240" w:lineRule="auto"/>
-              <w:jc w:val="left"/>
-            </w:pPr>
-            <w:r>
-              <w:rPr>
-                <w:sz w:val="17"/>
-              </w:rPr>
-              <w:t xml:space="preserve">SIPSA-DANE, promedio nacional, 26-oct-2026 (vía Agronegocios)</w:t>
+              <w:t xml:space="preserve">$1.936</w:t>
+            </w:r>
+          </w:p>
+        </w:tc>
+        <w:tc>
+          <w:tcPr/>
+          <w:p>
+            <w:pPr>
+              <w:pStyle w:val="Compact"/>
+              <w:spacing w:after="0" w:before="0" w:line="240" w:lineRule="auto"/>
+              <w:jc w:val="left"/>
+            </w:pPr>
+            <w:r>
+              <w:rPr>
+                <w:sz w:val="17"/>
+              </w:rPr>
+              <w:t xml:space="preserve">SIPSA-DANE, promedio nacional (vía Agronegocios), consulta 24-oct-2026</w:t>
             </w:r>
           </w:p>
         </w:tc>
@@ -28839,7 +29195,7 @@
               <w:rPr>
                 <w:sz w:val="17"/>
               </w:rPr>
-              <w:t xml:space="preserve">30 g</w:t>
+              <w:t xml:space="preserve">38 g</w:t>
             </w:r>
           </w:p>
         </w:tc>
@@ -28875,25 +29231,25 @@
               <w:rPr>
                 <w:sz w:val="17"/>
               </w:rPr>
-              <w:t xml:space="preserve">$332</w:t>
-            </w:r>
-          </w:p>
-        </w:tc>
-        <w:tc>
-          <w:tcPr>
-            <w:shd w:val="clear" w:color="auto" w:fill="F5F7FB"/>
-          </w:tcPr>
-          <w:p>
-            <w:pPr>
-              <w:pStyle w:val="Compact"/>
-              <w:spacing w:after="0" w:before="0" w:line="240" w:lineRule="auto"/>
-              <w:jc w:val="left"/>
-            </w:pPr>
-            <w:r>
-              <w:rPr>
-                <w:sz w:val="17"/>
-              </w:rPr>
-              <w:t xml:space="preserve">SIPSA-DANE, Cartagena (Bazurto), 26-oct-2026 (vía Agronegocios)</w:t>
+              <w:t xml:space="preserve">$421</w:t>
+            </w:r>
+          </w:p>
+        </w:tc>
+        <w:tc>
+          <w:tcPr>
+            <w:shd w:val="clear" w:color="auto" w:fill="F5F7FB"/>
+          </w:tcPr>
+          <w:p>
+            <w:pPr>
+              <w:pStyle w:val="Compact"/>
+              <w:spacing w:after="0" w:before="0" w:line="240" w:lineRule="auto"/>
+              <w:jc w:val="left"/>
+            </w:pPr>
+            <w:r>
+              <w:rPr>
+                <w:sz w:val="17"/>
+              </w:rPr>
+              <w:t xml:space="preserve">SIPSA-DANE, Cartagena (Bazurto) (vía Agronegocios), consulta 24-oct-2026</w:t>
             </w:r>
           </w:p>
         </w:tc>
@@ -28930,7 +29286,7 @@
               <w:rPr>
                 <w:sz w:val="17"/>
               </w:rPr>
-              <w:t xml:space="preserve">20 g</w:t>
+              <w:t xml:space="preserve">25 g</w:t>
             </w:r>
           </w:p>
         </w:tc>
@@ -28962,23 +29318,23 @@
               <w:rPr>
                 <w:sz w:val="17"/>
               </w:rPr>
-              <w:t xml:space="preserve">$47</w:t>
-            </w:r>
-          </w:p>
-        </w:tc>
-        <w:tc>
-          <w:tcPr/>
-          <w:p>
-            <w:pPr>
-              <w:pStyle w:val="Compact"/>
-              <w:spacing w:after="0" w:before="0" w:line="240" w:lineRule="auto"/>
-              <w:jc w:val="left"/>
-            </w:pPr>
-            <w:r>
-              <w:rPr>
-                <w:sz w:val="17"/>
-              </w:rPr>
-              <w:t xml:space="preserve">SIPSA-DANE, Cartagena (Bazurto), 26-oct-2026 (vía Agronegocios)</w:t>
+              <w:t xml:space="preserve">$59</w:t>
+            </w:r>
+          </w:p>
+        </w:tc>
+        <w:tc>
+          <w:tcPr/>
+          <w:p>
+            <w:pPr>
+              <w:pStyle w:val="Compact"/>
+              <w:spacing w:after="0" w:before="0" w:line="240" w:lineRule="auto"/>
+              <w:jc w:val="left"/>
+            </w:pPr>
+            <w:r>
+              <w:rPr>
+                <w:sz w:val="17"/>
+              </w:rPr>
+              <w:t xml:space="preserve">SIPSA-DANE, Cartagena (Bazurto) (vía Agronegocios), consulta 24-oct-2026</w:t>
             </w:r>
           </w:p>
         </w:tc>
@@ -29019,7 +29375,7 @@
               <w:rPr>
                 <w:sz w:val="17"/>
               </w:rPr>
-              <w:t xml:space="preserve">15 g</w:t>
+              <w:t xml:space="preserve">19 g</w:t>
             </w:r>
           </w:p>
         </w:tc>
@@ -29055,25 +29411,25 @@
               <w:rPr>
                 <w:sz w:val="17"/>
               </w:rPr>
-              <w:t xml:space="preserve">$36</w:t>
-            </w:r>
-          </w:p>
-        </w:tc>
-        <w:tc>
-          <w:tcPr>
-            <w:shd w:val="clear" w:color="auto" w:fill="F5F7FB"/>
-          </w:tcPr>
-          <w:p>
-            <w:pPr>
-              <w:pStyle w:val="Compact"/>
-              <w:spacing w:after="0" w:before="0" w:line="240" w:lineRule="auto"/>
-              <w:jc w:val="left"/>
-            </w:pPr>
-            <w:r>
-              <w:rPr>
-                <w:sz w:val="17"/>
-              </w:rPr>
-              <w:t xml:space="preserve">SIPSA-DANE, Cartagena (Bazurto), 26-oct-2026 (vía Agronegocios)</w:t>
+              <w:t xml:space="preserve">$46</w:t>
+            </w:r>
+          </w:p>
+        </w:tc>
+        <w:tc>
+          <w:tcPr>
+            <w:shd w:val="clear" w:color="auto" w:fill="F5F7FB"/>
+          </w:tcPr>
+          <w:p>
+            <w:pPr>
+              <w:pStyle w:val="Compact"/>
+              <w:spacing w:after="0" w:before="0" w:line="240" w:lineRule="auto"/>
+              <w:jc w:val="left"/>
+            </w:pPr>
+            <w:r>
+              <w:rPr>
+                <w:sz w:val="17"/>
+              </w:rPr>
+              <w:t xml:space="preserve">SIPSA-DANE, Cartagena (Bazurto) (vía Agronegocios), consulta 24-oct-2026</w:t>
             </w:r>
           </w:p>
         </w:tc>
@@ -29110,7 +29466,7 @@
               <w:rPr>
                 <w:sz w:val="17"/>
               </w:rPr>
-              <w:t xml:space="preserve">20 g</w:t>
+              <w:t xml:space="preserve">25 g</w:t>
             </w:r>
           </w:p>
         </w:tc>
@@ -29142,7 +29498,7 @@
               <w:rPr>
                 <w:sz w:val="17"/>
               </w:rPr>
-              <w:t xml:space="preserve">$684</w:t>
+              <w:t xml:space="preserve">$855</w:t>
             </w:r>
           </w:p>
         </w:tc>
@@ -29199,7 +29555,7 @@
               <w:rPr>
                 <w:sz w:val="17"/>
               </w:rPr>
-              <w:t xml:space="preserve">3 g</w:t>
+              <w:t xml:space="preserve">4 g</w:t>
             </w:r>
           </w:p>
         </w:tc>
@@ -29235,7 +29591,7 @@
               <w:rPr>
                 <w:sz w:val="17"/>
               </w:rPr>
-              <w:t xml:space="preserve">$144</w:t>
+              <w:t xml:space="preserve">$192</w:t>
             </w:r>
           </w:p>
         </w:tc>
@@ -29559,7 +29915,7 @@
               <w:rPr>
                 <w:sz w:val="17"/>
               </w:rPr>
-              <w:t xml:space="preserve">10 g</w:t>
+              <w:t xml:space="preserve">12 g</w:t>
             </w:r>
           </w:p>
         </w:tc>
@@ -29595,25 +29951,25 @@
               <w:rPr>
                 <w:sz w:val="17"/>
               </w:rPr>
-              <w:t xml:space="preserve">$185</w:t>
-            </w:r>
-          </w:p>
-        </w:tc>
-        <w:tc>
-          <w:tcPr>
-            <w:shd w:val="clear" w:color="auto" w:fill="F5F7FB"/>
-          </w:tcPr>
-          <w:p>
-            <w:pPr>
-              <w:pStyle w:val="Compact"/>
-              <w:spacing w:after="0" w:before="0" w:line="240" w:lineRule="auto"/>
-              <w:jc w:val="left"/>
-            </w:pPr>
-            <w:r>
-              <w:rPr>
-                <w:sz w:val="17"/>
-              </w:rPr>
-              <w:t xml:space="preserve">SIPSA-DANE, Cartagena (Bazurto), 26-oct-2026 (vía Agronegocios)</w:t>
+              <w:t xml:space="preserve">$222</w:t>
+            </w:r>
+          </w:p>
+        </w:tc>
+        <w:tc>
+          <w:tcPr>
+            <w:shd w:val="clear" w:color="auto" w:fill="F5F7FB"/>
+          </w:tcPr>
+          <w:p>
+            <w:pPr>
+              <w:pStyle w:val="Compact"/>
+              <w:spacing w:after="0" w:before="0" w:line="240" w:lineRule="auto"/>
+              <w:jc w:val="left"/>
+            </w:pPr>
+            <w:r>
+              <w:rPr>
+                <w:sz w:val="17"/>
+              </w:rPr>
+              <w:t xml:space="preserve">SIPSA-DANE, Cartagena (Bazurto) (vía Agronegocios), consulta 24-oct-2026</w:t>
             </w:r>
           </w:p>
         </w:tc>
@@ -29672,7 +30028,7 @@
                 <w:b/>
                 <w:sz w:val="17"/>
               </w:rPr>
-              <w:t xml:space="preserve">$9.255</w:t>
+              <w:t xml:space="preserve">$11.087</w:t>
             </w:r>
           </w:p>
         </w:tc>
@@ -29921,7 +30277,7 @@
               <w:rPr>
                 <w:sz w:val="16"/>
               </w:rPr>
-              <w:t xml:space="preserve">131,7 kg</w:t>
+              <w:t xml:space="preserve">164,6 kg</w:t>
             </w:r>
           </w:p>
         </w:tc>
@@ -29969,7 +30325,7 @@
               <w:rPr>
                 <w:sz w:val="16"/>
               </w:rPr>
-              <w:t xml:space="preserve">$2.147.838</w:t>
+              <w:t xml:space="preserve">$2.684.797</w:t>
             </w:r>
           </w:p>
         </w:tc>
@@ -30001,7 +30357,7 @@
               <w:rPr>
                 <w:sz w:val="16"/>
               </w:rPr>
-              <w:t xml:space="preserve">$2.147.838</w:t>
+              <w:t xml:space="preserve">$2.684.797</w:t>
             </w:r>
           </w:p>
         </w:tc>
@@ -30042,7 +30398,7 @@
               <w:rPr>
                 <w:sz w:val="16"/>
               </w:rPr>
-              <w:t xml:space="preserve">16,5 L</w:t>
+              <w:t xml:space="preserve">20,8 L</w:t>
             </w:r>
           </w:p>
         </w:tc>
@@ -30096,7 +30452,7 @@
               <w:rPr>
                 <w:sz w:val="16"/>
               </w:rPr>
-              <w:t xml:space="preserve">$394.970</w:t>
+              <w:t xml:space="preserve">$500.295</w:t>
             </w:r>
           </w:p>
         </w:tc>
@@ -30132,7 +30488,7 @@
               <w:rPr>
                 <w:sz w:val="16"/>
               </w:rPr>
-              <w:t xml:space="preserve">$394.970</w:t>
+              <w:t xml:space="preserve">$500.295</w:t>
             </w:r>
           </w:p>
         </w:tc>
@@ -30169,7 +30525,7 @@
               <w:rPr>
                 <w:sz w:val="16"/>
               </w:rPr>
-              <w:t xml:space="preserve">5,5 kg</w:t>
+              <w:t xml:space="preserve">6,6 kg</w:t>
             </w:r>
           </w:p>
         </w:tc>
@@ -30217,7 +30573,7 @@
               <w:rPr>
                 <w:sz w:val="16"/>
               </w:rPr>
-              <w:t xml:space="preserve">$20.955</w:t>
+              <w:t xml:space="preserve">$25.146</w:t>
             </w:r>
           </w:p>
         </w:tc>
@@ -30249,7 +30605,7 @@
               <w:rPr>
                 <w:sz w:val="16"/>
               </w:rPr>
-              <w:t xml:space="preserve">$20.955</w:t>
+              <w:t xml:space="preserve">$25.146</w:t>
             </w:r>
           </w:p>
         </w:tc>
@@ -30520,25 +30876,25 @@
               <w:rPr>
                 <w:sz w:val="16"/>
               </w:rPr>
-              <w:t xml:space="preserve">Pargo rojo entero fresco (pesca artesanal; 45 g de filete, rinde 46 %)</w:t>
-            </w:r>
-          </w:p>
-        </w:tc>
-        <w:tc>
-          <w:tcPr>
-            <w:shd w:val="clear" w:color="auto" w:fill="F5F7FB"/>
-          </w:tcPr>
-          <w:p>
-            <w:pPr>
-              <w:pStyle w:val="Compact"/>
-              <w:spacing w:after="0" w:before="0" w:line="240" w:lineRule="auto"/>
-              <w:jc w:val="right"/>
-            </w:pPr>
-            <w:r>
-              <w:rPr>
-                <w:sz w:val="16"/>
-              </w:rPr>
-              <w:t xml:space="preserve">107,3 kg</w:t>
+              <w:t xml:space="preserve">Pargo rojo entero fresco (pesca artesanal; 56 g de filete, rinde 46 %)</w:t>
+            </w:r>
+          </w:p>
+        </w:tc>
+        <w:tc>
+          <w:tcPr>
+            <w:shd w:val="clear" w:color="auto" w:fill="F5F7FB"/>
+          </w:tcPr>
+          <w:p>
+            <w:pPr>
+              <w:pStyle w:val="Compact"/>
+              <w:spacing w:after="0" w:before="0" w:line="240" w:lineRule="auto"/>
+              <w:jc w:val="right"/>
+            </w:pPr>
+            <w:r>
+              <w:rPr>
+                <w:sz w:val="16"/>
+              </w:rPr>
+              <w:t xml:space="preserve">133,6 kg</w:t>
             </w:r>
           </w:p>
         </w:tc>
@@ -30592,7 +30948,7 @@
               <w:rPr>
                 <w:sz w:val="16"/>
               </w:rPr>
-              <w:t xml:space="preserve">$2.253.905</w:t>
+              <w:t xml:space="preserve">$2.804.859</w:t>
             </w:r>
           </w:p>
         </w:tc>
@@ -30628,7 +30984,7 @@
               <w:rPr>
                 <w:sz w:val="16"/>
               </w:rPr>
-              <w:t xml:space="preserve">$2.253.905</w:t>
+              <w:t xml:space="preserve">$2.804.859</w:t>
             </w:r>
           </w:p>
         </w:tc>
@@ -30665,7 +31021,7 @@
               <w:rPr>
                 <w:sz w:val="16"/>
               </w:rPr>
-              <w:t xml:space="preserve">27,4 kg</w:t>
+              <w:t xml:space="preserve">34,0 kg</w:t>
             </w:r>
           </w:p>
         </w:tc>
@@ -30713,7 +31069,7 @@
               <w:rPr>
                 <w:sz w:val="16"/>
               </w:rPr>
-              <w:t xml:space="preserve">$1.712.771</w:t>
+              <w:t xml:space="preserve">$2.123.836</w:t>
             </w:r>
           </w:p>
         </w:tc>
@@ -30745,7 +31101,7 @@
               <w:rPr>
                 <w:sz w:val="16"/>
               </w:rPr>
-              <w:t xml:space="preserve">$1.712.771</w:t>
+              <w:t xml:space="preserve">$2.123.836</w:t>
             </w:r>
           </w:p>
         </w:tc>
@@ -30786,7 +31142,7 @@
               <w:rPr>
                 <w:sz w:val="16"/>
               </w:rPr>
-              <w:t xml:space="preserve">32,9 kg</w:t>
+              <w:t xml:space="preserve">41,7 kg</w:t>
             </w:r>
           </w:p>
         </w:tc>
@@ -30840,7 +31196,7 @@
               <w:rPr>
                 <w:sz w:val="16"/>
               </w:rPr>
-              <w:t xml:space="preserve">$364.788</w:t>
+              <w:t xml:space="preserve">$462.064</w:t>
             </w:r>
           </w:p>
         </w:tc>
@@ -30876,7 +31232,7 @@
               <w:rPr>
                 <w:sz w:val="16"/>
               </w:rPr>
-              <w:t xml:space="preserve">$364.788</w:t>
+              <w:t xml:space="preserve">$462.064</w:t>
             </w:r>
           </w:p>
         </w:tc>
@@ -30913,7 +31269,7 @@
               <w:rPr>
                 <w:sz w:val="16"/>
               </w:rPr>
-              <w:t xml:space="preserve">21,9 kg</w:t>
+              <w:t xml:space="preserve">27,4 kg</w:t>
             </w:r>
           </w:p>
         </w:tc>
@@ -30961,7 +31317,7 @@
               <w:rPr>
                 <w:sz w:val="16"/>
               </w:rPr>
-              <w:t xml:space="preserve">$51.939</w:t>
+              <w:t xml:space="preserve">$64.923</w:t>
             </w:r>
           </w:p>
         </w:tc>
@@ -30993,7 +31349,7 @@
               <w:rPr>
                 <w:sz w:val="16"/>
               </w:rPr>
-              <w:t xml:space="preserve">$51.939</w:t>
+              <w:t xml:space="preserve">$64.923</w:t>
             </w:r>
           </w:p>
         </w:tc>
@@ -31034,7 +31390,7 @@
               <w:rPr>
                 <w:sz w:val="16"/>
               </w:rPr>
-              <w:t xml:space="preserve">16,5 kg</w:t>
+              <w:t xml:space="preserve">20,8 kg</w:t>
             </w:r>
           </w:p>
         </w:tc>
@@ -31088,7 +31444,7 @@
               <w:rPr>
                 <w:sz w:val="16"/>
               </w:rPr>
-              <w:t xml:space="preserve">$39.497</w:t>
+              <w:t xml:space="preserve">$50.030</w:t>
             </w:r>
           </w:p>
         </w:tc>
@@ -31124,7 +31480,7 @@
               <w:rPr>
                 <w:sz w:val="16"/>
               </w:rPr>
-              <w:t xml:space="preserve">$39.497</w:t>
+              <w:t xml:space="preserve">$50.030</w:t>
             </w:r>
           </w:p>
         </w:tc>
@@ -31161,7 +31517,7 @@
               <w:rPr>
                 <w:sz w:val="16"/>
               </w:rPr>
-              <w:t xml:space="preserve">21,9 kg</w:t>
+              <w:t xml:space="preserve">27,4 kg</w:t>
             </w:r>
           </w:p>
         </w:tc>
@@ -31209,7 +31565,7 @@
               <w:rPr>
                 <w:sz w:val="16"/>
               </w:rPr>
-              <w:t xml:space="preserve">$750.674</w:t>
+              <w:t xml:space="preserve">$938.342</w:t>
             </w:r>
           </w:p>
         </w:tc>
@@ -31241,7 +31597,7 @@
               <w:rPr>
                 <w:sz w:val="16"/>
               </w:rPr>
-              <w:t xml:space="preserve">$750.674</w:t>
+              <w:t xml:space="preserve">$938.342</w:t>
             </w:r>
           </w:p>
         </w:tc>
@@ -31282,7 +31638,7 @@
               <w:rPr>
                 <w:sz w:val="16"/>
               </w:rPr>
-              <w:t xml:space="preserve">3,3 kg</w:t>
+              <w:t xml:space="preserve">4,4 kg</w:t>
             </w:r>
           </w:p>
         </w:tc>
@@ -31336,7 +31692,7 @@
               <w:rPr>
                 <w:sz w:val="16"/>
               </w:rPr>
-              <w:t xml:space="preserve">$157.988</w:t>
+              <w:t xml:space="preserve">$210.651</w:t>
             </w:r>
           </w:p>
         </w:tc>
@@ -31372,7 +31728,7 @@
               <w:rPr>
                 <w:sz w:val="16"/>
               </w:rPr>
-              <w:t xml:space="preserve">$157.988</w:t>
+              <w:t xml:space="preserve">$210.651</w:t>
             </w:r>
           </w:p>
         </w:tc>
@@ -31778,7 +32134,7 @@
               <w:rPr>
                 <w:sz w:val="16"/>
               </w:rPr>
-              <w:t xml:space="preserve">11,0 kg</w:t>
+              <w:t xml:space="preserve">13,2 kg</w:t>
             </w:r>
           </w:p>
         </w:tc>
@@ -31832,7 +32188,7 @@
               <w:rPr>
                 <w:sz w:val="16"/>
               </w:rPr>
-              <w:t xml:space="preserve">$202.861</w:t>
+              <w:t xml:space="preserve">$243.433</w:t>
             </w:r>
           </w:p>
         </w:tc>
@@ -31868,7 +32224,7 @@
               <w:rPr>
                 <w:sz w:val="16"/>
               </w:rPr>
-              <w:t xml:space="preserve">$202.861</w:t>
+              <w:t xml:space="preserve">$243.433</w:t>
             </w:r>
           </w:p>
         </w:tc>
@@ -32946,7 +33302,7 @@
                 <w:b/>
                 <w:sz w:val="16"/>
               </w:rPr>
-              <w:t xml:space="preserve">$10.900.953</w:t>
+              <w:t xml:space="preserve">$12.911.146</w:t>
             </w:r>
           </w:p>
         </w:tc>
@@ -33069,7 +33425,7 @@
                 <w:b/>
                 <w:sz w:val="16"/>
               </w:rPr>
-              <w:t xml:space="preserve">Costo unitario = $10.900.953 ÷ 1.097</w:t>
+              <w:t xml:space="preserve">Costo unitario = $12.911.146 ÷ 1.097</w:t>
             </w:r>
           </w:p>
         </w:tc>
@@ -33132,7 +33488,7 @@
                 <w:b/>
                 <w:sz w:val="16"/>
               </w:rPr>
-              <w:t xml:space="preserve">$9.936</w:t>
+              <w:t xml:space="preserve">$11.768</w:t>
             </w:r>
           </w:p>
         </w:tc>
@@ -33162,6 +33518,14 @@
       </w:pPr>
       <w:r>
         <w:t xml:space="preserve">6.3 Tabla de insumos y costos para Ramen</w:t>
+      </w:r>
+    </w:p>
+    <w:p>
+      <w:pPr>
+        <w:pStyle w:val="FirstParagraph"/>
+      </w:pPr>
+      <w:r>
+        <w:t xml:space="preserve">El ramen combina insumos locales para el caldo y el chashu con insumos importados para el fideo y el tare. Las tablas presentan la receta estándar por porción y el costeo mensual en formato Punto 6.</w:t>
       </w:r>
     </w:p>
     <w:p>
@@ -33483,7 +33847,7 @@
               <w:rPr>
                 <w:sz w:val="17"/>
               </w:rPr>
-              <w:t xml:space="preserve">SIPSA-DANE, región Caribe, 26-oct-2026 (vía Agronegocios)</w:t>
+              <w:t xml:space="preserve">SIPSA-DANE, región Caribe (vía Agronegocios), consulta 24-oct-2026</w:t>
             </w:r>
           </w:p>
         </w:tc>
@@ -33568,7 +33932,7 @@
               <w:rPr>
                 <w:sz w:val="17"/>
               </w:rPr>
-              <w:t xml:space="preserve">SIPSA-DANE, promedio nacional, 26-oct-2026 (vía Agronegocios)</w:t>
+              <w:t xml:space="preserve">SIPSA-DANE, promedio nacional (vía Agronegocios), consulta 24-oct-2026</w:t>
             </w:r>
           </w:p>
         </w:tc>
@@ -33663,7 +34027,7 @@
               <w:rPr>
                 <w:sz w:val="17"/>
               </w:rPr>
-              <w:t xml:space="preserve">SIPSA-DANE, promedio nacional, 26-oct-2026 (vía Agronegocios)</w:t>
+              <w:t xml:space="preserve">SIPSA-DANE, promedio nacional (vía Agronegocios), consulta 24-oct-2026</w:t>
             </w:r>
           </w:p>
         </w:tc>
@@ -33748,7 +34112,7 @@
               <w:rPr>
                 <w:sz w:val="17"/>
               </w:rPr>
-              <w:t xml:space="preserve">SIPSA-DANE, Cartagena (Bazurto), 26-oct-2026 (vía Agronegocios)</w:t>
+              <w:t xml:space="preserve">SIPSA-DANE, Cartagena (Bazurto) (vía Agronegocios), consulta 24-oct-2026</w:t>
             </w:r>
           </w:p>
         </w:tc>
@@ -34203,7 +34567,7 @@
               <w:rPr>
                 <w:sz w:val="17"/>
               </w:rPr>
-              <w:t xml:space="preserve">SIPSA-DANE, Cartagena (Bazurto), 26-oct-2026 (vía Agronegocios)</w:t>
+              <w:t xml:space="preserve">SIPSA-DANE, Cartagena (Bazurto) (vía Agronegocios), consulta 24-oct-2026</w:t>
             </w:r>
           </w:p>
         </w:tc>
@@ -34288,7 +34652,7 @@
               <w:rPr>
                 <w:sz w:val="17"/>
               </w:rPr>
-              <w:t xml:space="preserve">SIPSA-DANE, Cartagena (Bazurto), 26-oct-2026 (vía Agronegocios)</w:t>
+              <w:t xml:space="preserve">SIPSA-DANE, Cartagena (Bazurto) (vía Agronegocios), consulta 24-oct-2026</w:t>
             </w:r>
           </w:p>
         </w:tc>
@@ -34383,7 +34747,7 @@
               <w:rPr>
                 <w:sz w:val="17"/>
               </w:rPr>
-              <w:t xml:space="preserve">SIPSA-DANE, Cartagena (Bazurto), 26-oct-2026 (vía Agronegocios)</w:t>
+              <w:t xml:space="preserve">SIPSA-DANE, Cartagena (Bazurto) (vía Agronegocios), consulta 24-oct-2026</w:t>
             </w:r>
           </w:p>
         </w:tc>
@@ -37418,6 +37782,14 @@
     </w:p>
     <w:p>
       <w:pPr>
+        <w:pStyle w:val="FirstParagraph"/>
+      </w:pPr>
+      <w:r>
+        <w:t xml:space="preserve">En la tempura el langostino representa la mayor parte del costo, mientras que los vegetales de Bazurto son económicos. Las tablas presentan la receta estándar por porción y el costeo mensual en formato Punto 6.</w:t>
+      </w:r>
+    </w:p>
+    <w:p>
+      <w:pPr>
         <w:pStyle w:val="TableCaption"/>
       </w:pPr>
       <w:r>
@@ -37640,7 +38012,7 @@
               <w:rPr>
                 <w:sz w:val="17"/>
               </w:rPr>
-              <w:t xml:space="preserve">SIPSA-DANE, promedio nacional, 26-oct-2026 (vía Agronegocios)</w:t>
+              <w:t xml:space="preserve">SIPSA-DANE, promedio nacional (vía Agronegocios), consulta 24-oct-2026</w:t>
             </w:r>
           </w:p>
         </w:tc>
@@ -37735,7 +38107,7 @@
               <w:rPr>
                 <w:sz w:val="17"/>
               </w:rPr>
-              <w:t xml:space="preserve">SIPSA-DANE, Cartagena (Bazurto), 26-oct-2026 (vía Agronegocios)</w:t>
+              <w:t xml:space="preserve">SIPSA-DANE, Cartagena (Bazurto) (vía Agronegocios), consulta 24-oct-2026</w:t>
             </w:r>
           </w:p>
         </w:tc>
@@ -37820,7 +38192,7 @@
               <w:rPr>
                 <w:sz w:val="17"/>
               </w:rPr>
-              <w:t xml:space="preserve">SIPSA-DANE, Cartagena (Bazurto), 26-oct-2026 (vía Agronegocios)</w:t>
+              <w:t xml:space="preserve">SIPSA-DANE, Cartagena (Bazurto) (vía Agronegocios), consulta 24-oct-2026</w:t>
             </w:r>
           </w:p>
         </w:tc>
@@ -37915,7 +38287,7 @@
               <w:rPr>
                 <w:sz w:val="17"/>
               </w:rPr>
-              <w:t xml:space="preserve">SIPSA-DANE, Cartagena (Bazurto), 26-oct-2026 (vía Agronegocios)</w:t>
+              <w:t xml:space="preserve">SIPSA-DANE, Cartagena (Bazurto) (vía Agronegocios), consulta 24-oct-2026</w:t>
             </w:r>
           </w:p>
         </w:tc>
@@ -38095,7 +38467,7 @@
               <w:rPr>
                 <w:sz w:val="17"/>
               </w:rPr>
-              <w:t xml:space="preserve">SIPSA-DANE, Cartagena (Bazurto), 26-oct-2026 (vía Agronegocios)</w:t>
+              <w:t xml:space="preserve">SIPSA-DANE, Cartagena (Bazurto) (vía Agronegocios), consulta 24-oct-2026</w:t>
             </w:r>
           </w:p>
         </w:tc>
@@ -38180,7 +38552,7 @@
               <w:rPr>
                 <w:sz w:val="17"/>
               </w:rPr>
-              <w:t xml:space="preserve">SIPSA-DANE, Cartagena (Bazurto), 26-oct-2026 (vía Agronegocios)</w:t>
+              <w:t xml:space="preserve">SIPSA-DANE, Cartagena (Bazurto) (vía Agronegocios), consulta 24-oct-2026</w:t>
             </w:r>
           </w:p>
         </w:tc>
@@ -38275,7 +38647,7 @@
               <w:rPr>
                 <w:sz w:val="17"/>
               </w:rPr>
-              <w:t xml:space="preserve">SIPSA-DANE, Cartagena (Bazurto), 26-oct-2026 (vía Agronegocios)</w:t>
+              <w:t xml:space="preserve">SIPSA-DANE, Cartagena (Bazurto) (vía Agronegocios), consulta 24-oct-2026</w:t>
             </w:r>
           </w:p>
         </w:tc>
@@ -38635,7 +39007,7 @@
               <w:rPr>
                 <w:sz w:val="17"/>
               </w:rPr>
-              <w:t xml:space="preserve">SIPSA-DANE, Cartagena (Bazurto), 26-oct-2026 (vía Agronegocios)</w:t>
+              <w:t xml:space="preserve">SIPSA-DANE, Cartagena (Bazurto) (vía Agronegocios), consulta 24-oct-2026</w:t>
             </w:r>
           </w:p>
         </w:tc>
@@ -41317,6 +41689,14 @@
     </w:p>
     <w:p>
       <w:pPr>
+        <w:pStyle w:val="BodyText"/>
+      </w:pPr>
+      <w:r>
+        <w:t xml:space="preserve">La siguiente tabla reúne los resultados de los tres platos para compararlos: unidades al mes, costo de materia prima, costo unitario, precio de venta, food cost y margen de contribución.</w:t>
+      </w:r>
+    </w:p>
+    <w:p>
+      <w:pPr>
         <w:pStyle w:val="TableCaption"/>
       </w:pPr>
       <w:r>
@@ -41543,7 +41923,7 @@
               <w:rPr>
                 <w:sz w:val="18"/>
               </w:rPr>
-              <w:t xml:space="preserve">$9.255</w:t>
+              <w:t xml:space="preserve">$11.087</w:t>
             </w:r>
           </w:p>
         </w:tc>
@@ -41616,7 +41996,7 @@
               <w:rPr>
                 <w:sz w:val="18"/>
               </w:rPr>
-              <w:t xml:space="preserve">$10.900.953</w:t>
+              <w:t xml:space="preserve">$12.911.146</w:t>
             </w:r>
           </w:p>
         </w:tc>
@@ -41693,7 +42073,7 @@
                 <w:b/>
                 <w:sz w:val="18"/>
               </w:rPr>
-              <w:t xml:space="preserve">$9.936</w:t>
+              <w:t xml:space="preserve">$11.768</w:t>
             </w:r>
           </w:p>
         </w:tc>
@@ -41843,7 +42223,7 @@
               <w:rPr>
                 <w:sz w:val="18"/>
               </w:rPr>
-              <w:t xml:space="preserve">25,0 %</w:t>
+              <w:t xml:space="preserve">29,9 %</w:t>
             </w:r>
           </w:p>
         </w:tc>
@@ -41916,7 +42296,7 @@
               <w:rPr>
                 <w:sz w:val="18"/>
               </w:rPr>
-              <w:t xml:space="preserve">$27.101</w:t>
+              <w:t xml:space="preserve">$25.269</w:t>
             </w:r>
           </w:p>
         </w:tc>
@@ -42039,6 +42419,14 @@
     </w:p>
     <w:p>
       <w:pPr>
+        <w:pStyle w:val="FirstParagraph"/>
+      </w:pPr>
+      <w:r>
+        <w:t xml:space="preserve">El costo de insumos de cada año se obtiene multiplicando el costo de materia prima de cada receta por las unidades que Kazegami servirá según su capacidad utilizada. La tabla presenta ese consolidado para 2027-2031 a precios constantes de 2026.</w:t>
+      </w:r>
+    </w:p>
+    <w:p>
+      <w:pPr>
         <w:pStyle w:val="TableCaption"/>
       </w:pPr>
       <w:r>
@@ -42271,7 +42659,7 @@
               <w:rPr>
                 <w:sz w:val="16"/>
               </w:rPr>
-              <w:t xml:space="preserve">$121.849.051</w:t>
+              <w:t xml:space="preserve">$145.971.362</w:t>
             </w:r>
           </w:p>
         </w:tc>
@@ -42321,23 +42709,23 @@
                 <w:b/>
                 <w:sz w:val="16"/>
               </w:rPr>
-              <w:t xml:space="preserve">$316.772.144</w:t>
-            </w:r>
-          </w:p>
-        </w:tc>
-        <w:tc>
-          <w:tcPr/>
-          <w:p>
-            <w:pPr>
-              <w:pStyle w:val="Compact"/>
-              <w:spacing w:after="0" w:before="0" w:line="240" w:lineRule="auto"/>
-              <w:jc w:val="right"/>
-            </w:pPr>
-            <w:r>
-              <w:rPr>
-                <w:sz w:val="16"/>
-              </w:rPr>
-              <w:t xml:space="preserve">$26.397.679</w:t>
+              <w:t xml:space="preserve">$340.894.455</w:t>
+            </w:r>
+          </w:p>
+        </w:tc>
+        <w:tc>
+          <w:tcPr/>
+          <w:p>
+            <w:pPr>
+              <w:pStyle w:val="Compact"/>
+              <w:spacing w:after="0" w:before="0" w:line="240" w:lineRule="auto"/>
+              <w:jc w:val="right"/>
+            </w:pPr>
+            <w:r>
+              <w:rPr>
+                <w:sz w:val="16"/>
+              </w:rPr>
+              <w:t xml:space="preserve">$28.407.871</w:t>
             </w:r>
           </w:p>
         </w:tc>
@@ -42396,7 +42784,7 @@
               <w:rPr>
                 <w:sz w:val="16"/>
               </w:rPr>
-              <w:t xml:space="preserve">$141.344.899</w:t>
+              <w:t xml:space="preserve">$169.326.780</w:t>
             </w:r>
           </w:p>
         </w:tc>
@@ -42452,25 +42840,25 @@
                 <w:b/>
                 <w:sz w:val="16"/>
               </w:rPr>
-              <w:t xml:space="preserve">$367.455.687</w:t>
-            </w:r>
-          </w:p>
-        </w:tc>
-        <w:tc>
-          <w:tcPr>
-            <w:shd w:val="clear" w:color="auto" w:fill="F5F7FB"/>
-          </w:tcPr>
-          <w:p>
-            <w:pPr>
-              <w:pStyle w:val="Compact"/>
-              <w:spacing w:after="0" w:before="0" w:line="240" w:lineRule="auto"/>
-              <w:jc w:val="right"/>
-            </w:pPr>
-            <w:r>
-              <w:rPr>
-                <w:sz w:val="16"/>
-              </w:rPr>
-              <w:t xml:space="preserve">$30.621.307</w:t>
+              <w:t xml:space="preserve">$395.437.568</w:t>
+            </w:r>
+          </w:p>
+        </w:tc>
+        <w:tc>
+          <w:tcPr>
+            <w:shd w:val="clear" w:color="auto" w:fill="F5F7FB"/>
+          </w:tcPr>
+          <w:p>
+            <w:pPr>
+              <w:pStyle w:val="Compact"/>
+              <w:spacing w:after="0" w:before="0" w:line="240" w:lineRule="auto"/>
+              <w:jc w:val="right"/>
+            </w:pPr>
+            <w:r>
+              <w:rPr>
+                <w:sz w:val="16"/>
+              </w:rPr>
+              <w:t xml:space="preserve">$32.953.131</w:t>
             </w:r>
           </w:p>
         </w:tc>
@@ -42523,7 +42911,7 @@
               <w:rPr>
                 <w:sz w:val="16"/>
               </w:rPr>
-              <w:t xml:space="preserve">$160.840.747</w:t>
+              <w:t xml:space="preserve">$192.682.198</w:t>
             </w:r>
           </w:p>
         </w:tc>
@@ -42573,23 +42961,23 @@
                 <w:b/>
                 <w:sz w:val="16"/>
               </w:rPr>
-              <w:t xml:space="preserve">$418.139.230</w:t>
-            </w:r>
-          </w:p>
-        </w:tc>
-        <w:tc>
-          <w:tcPr/>
-          <w:p>
-            <w:pPr>
-              <w:pStyle w:val="Compact"/>
-              <w:spacing w:after="0" w:before="0" w:line="240" w:lineRule="auto"/>
-              <w:jc w:val="right"/>
-            </w:pPr>
-            <w:r>
-              <w:rPr>
-                <w:sz w:val="16"/>
-              </w:rPr>
-              <w:t xml:space="preserve">$34.844.936</w:t>
+              <w:t xml:space="preserve">$449.980.681</w:t>
+            </w:r>
+          </w:p>
+        </w:tc>
+        <w:tc>
+          <w:tcPr/>
+          <w:p>
+            <w:pPr>
+              <w:pStyle w:val="Compact"/>
+              <w:spacing w:after="0" w:before="0" w:line="240" w:lineRule="auto"/>
+              <w:jc w:val="right"/>
+            </w:pPr>
+            <w:r>
+              <w:rPr>
+                <w:sz w:val="16"/>
+              </w:rPr>
+              <w:t xml:space="preserve">$37.498.390</w:t>
             </w:r>
           </w:p>
         </w:tc>
@@ -42648,7 +43036,7 @@
               <w:rPr>
                 <w:sz w:val="16"/>
               </w:rPr>
-              <w:t xml:space="preserve">$177.899.615</w:t>
+              <w:t xml:space="preserve">$213.118.189</w:t>
             </w:r>
           </w:p>
         </w:tc>
@@ -42704,25 +43092,25 @@
                 <w:b/>
                 <w:sz w:val="16"/>
               </w:rPr>
-              <w:t xml:space="preserve">$462.487.330</w:t>
-            </w:r>
-          </w:p>
-        </w:tc>
-        <w:tc>
-          <w:tcPr>
-            <w:shd w:val="clear" w:color="auto" w:fill="F5F7FB"/>
-          </w:tcPr>
-          <w:p>
-            <w:pPr>
-              <w:pStyle w:val="Compact"/>
-              <w:spacing w:after="0" w:before="0" w:line="240" w:lineRule="auto"/>
-              <w:jc w:val="right"/>
-            </w:pPr>
-            <w:r>
-              <w:rPr>
-                <w:sz w:val="16"/>
-              </w:rPr>
-              <w:t xml:space="preserve">$38.540.611</w:t>
+              <w:t xml:space="preserve">$497.705.905</w:t>
+            </w:r>
+          </w:p>
+        </w:tc>
+        <w:tc>
+          <w:tcPr>
+            <w:shd w:val="clear" w:color="auto" w:fill="F5F7FB"/>
+          </w:tcPr>
+          <w:p>
+            <w:pPr>
+              <w:pStyle w:val="Compact"/>
+              <w:spacing w:after="0" w:before="0" w:line="240" w:lineRule="auto"/>
+              <w:jc w:val="right"/>
+            </w:pPr>
+            <w:r>
+              <w:rPr>
+                <w:sz w:val="16"/>
+              </w:rPr>
+              <w:t xml:space="preserve">$41.475.492</w:t>
             </w:r>
           </w:p>
         </w:tc>
@@ -42775,7 +43163,7 @@
               <w:rPr>
                 <w:sz w:val="16"/>
               </w:rPr>
-              <w:t xml:space="preserve">$194.958.482</w:t>
+              <w:t xml:space="preserve">$233.554.180</w:t>
             </w:r>
           </w:p>
         </w:tc>
@@ -42825,23 +43213,23 @@
                 <w:b/>
                 <w:sz w:val="16"/>
               </w:rPr>
-              <w:t xml:space="preserve">$506.835.430</w:t>
-            </w:r>
-          </w:p>
-        </w:tc>
-        <w:tc>
-          <w:tcPr/>
-          <w:p>
-            <w:pPr>
-              <w:pStyle w:val="Compact"/>
-              <w:spacing w:after="0" w:before="0" w:line="240" w:lineRule="auto"/>
-              <w:jc w:val="right"/>
-            </w:pPr>
-            <w:r>
-              <w:rPr>
-                <w:sz w:val="16"/>
-              </w:rPr>
-              <w:t xml:space="preserve">$42.236.286</w:t>
+              <w:t xml:space="preserve">$545.431.128</w:t>
+            </w:r>
+          </w:p>
+        </w:tc>
+        <w:tc>
+          <w:tcPr/>
+          <w:p>
+            <w:pPr>
+              <w:pStyle w:val="Compact"/>
+              <w:spacing w:after="0" w:before="0" w:line="240" w:lineRule="auto"/>
+              <w:jc w:val="right"/>
+            </w:pPr>
+            <w:r>
+              <w:rPr>
+                <w:sz w:val="16"/>
+              </w:rPr>
+              <w:t xml:space="preserve">$45.452.594</w:t>
             </w:r>
           </w:p>
         </w:tc>
@@ -42948,6 +43336,14 @@
     </w:p>
     <w:p>
       <w:pPr>
+        <w:pStyle w:val="FirstParagraph"/>
+      </w:pPr>
+      <w:r>
+        <w:t xml:space="preserve">Los equipos son la mayor parte de la inversión técnica. La tabla presenta cada equipo con su precio, su depreciación mensual —que es la forma en que entra al costo de los platos— y si el precio fue verificado con un proveedor o es una estimación del equipo.</w:t>
+      </w:r>
+    </w:p>
+    <w:p>
+      <w:pPr>
         <w:pStyle w:val="TableCaption"/>
       </w:pPr>
       <w:r>
@@ -46678,6 +47074,14 @@
     </w:p>
     <w:p>
       <w:pPr>
+        <w:pStyle w:val="FirstParagraph"/>
+      </w:pPr>
+      <w:r>
+        <w:t xml:space="preserve">Esta sección agrupa los activos que no son equipos de cocina: el mobiliario del salón, la adecuación del local (obra civil, instalaciones eléctricas, de gas y extracción) y el hardware de tecnología, además del software, que se paga como gasto anual.</w:t>
+      </w:r>
+    </w:p>
+    <w:p>
+      <w:pPr>
         <w:pStyle w:val="TableCaption"/>
       </w:pPr>
       <w:r>
@@ -49372,6 +49776,14 @@
     </w:p>
     <w:p>
       <w:pPr>
+        <w:pStyle w:val="FirstParagraph"/>
+      </w:pPr>
+      <w:r>
+        <w:t xml:space="preserve">Para terminar, se consolidan todos los rubros en dos tablas: la inversión técnica inicial, que se hace una sola vez antes de abrir, y los costos de operación mensuales, que se pagan cada mes durante el funcionamiento del restaurante.</w:t>
+      </w:r>
+    </w:p>
+    <w:p>
+      <w:pPr>
         <w:pStyle w:val="TableCaption"/>
       </w:pPr>
       <w:r>
@@ -49785,7 +50197,7 @@
               <w:rPr>
                 <w:sz w:val="18"/>
               </w:rPr>
-              <w:t xml:space="preserve">$26.397.679</w:t>
+              <w:t xml:space="preserve">$28.407.871</w:t>
             </w:r>
           </w:p>
         </w:tc>
@@ -49844,7 +50256,7 @@
                 <w:b/>
                 <w:sz w:val="18"/>
               </w:rPr>
-              <w:t xml:space="preserve">$394.891.102</w:t>
+              <w:t xml:space="preserve">$396.901.294</w:t>
             </w:r>
           </w:p>
         </w:tc>
@@ -49934,6 +50346,14 @@
     </w:p>
     <w:p>
       <w:pPr>
+        <w:pStyle w:val="BodyText"/>
+      </w:pPr>
+      <w:r>
+        <w:t xml:space="preserve">La maquinaria y los equipos concentran la mayor parte de la inversión, como muestra la figura. A continuación se presentan los costos mensuales de operación, que incluyen la nómina, los insumos, los servicios públicos (Afinia, Aguas de Cartagena, Surtigas y Pacaribe) y la depreciación.</w:t>
+      </w:r>
+    </w:p>
+    <w:p>
+      <w:pPr>
         <w:pStyle w:val="TableCaption"/>
       </w:pPr>
       <w:r>
@@ -50123,7 +50543,7 @@
               <w:rPr>
                 <w:sz w:val="18"/>
               </w:rPr>
-              <w:t xml:space="preserve">$26.397.679</w:t>
+              <w:t xml:space="preserve">$28.407.871</w:t>
             </w:r>
           </w:p>
         </w:tc>
@@ -50329,7 +50749,7 @@
               <w:rPr>
                 <w:sz w:val="18"/>
               </w:rPr>
-              <w:t xml:space="preserve">Gas natural (Gases del Caribe)</w:t>
+              <w:t xml:space="preserve">Gas natural (Surtigas)</w:t>
             </w:r>
           </w:p>
         </w:tc>
@@ -50498,7 +50918,7 @@
               <w:rPr>
                 <w:sz w:val="18"/>
               </w:rPr>
-              <w:t xml:space="preserve">Aseo, fumigación y control de plagas</w:t>
+              <w:t xml:space="preserve">Recolección de residuos (Pacaribe, usuario no residencial; estimación)</w:t>
             </w:r>
           </w:p>
         </w:tc>
@@ -50514,7 +50934,7 @@
               <w:rPr>
                 <w:sz w:val="18"/>
               </w:rPr>
-              <w:t xml:space="preserve">$450.000</w:t>
+              <w:t xml:space="preserve">$250.000</w:t>
             </w:r>
           </w:p>
         </w:tc>
@@ -50553,7 +50973,7 @@
               <w:rPr>
                 <w:sz w:val="18"/>
               </w:rPr>
-              <w:t xml:space="preserve">Mantenimiento de equipos</w:t>
+              <w:t xml:space="preserve">Fumigación y control de plagas (estimación)</w:t>
             </w:r>
           </w:p>
         </w:tc>
@@ -50571,7 +50991,7 @@
               <w:rPr>
                 <w:sz w:val="18"/>
               </w:rPr>
-              <w:t xml:space="preserve">$600.000</w:t>
+              <w:t xml:space="preserve">$200.000</w:t>
             </w:r>
           </w:p>
         </w:tc>
@@ -50610,7 +51030,7 @@
               <w:rPr>
                 <w:sz w:val="18"/>
               </w:rPr>
-              <w:t xml:space="preserve">Seguros (todo riesgo y responsabilidad civil)</w:t>
+              <w:t xml:space="preserve">Mantenimiento de equipos</w:t>
             </w:r>
           </w:p>
         </w:tc>
@@ -50626,7 +51046,7 @@
               <w:rPr>
                 <w:sz w:val="18"/>
               </w:rPr>
-              <w:t xml:space="preserve">$550.000</w:t>
+              <w:t xml:space="preserve">$600.000</w:t>
             </w:r>
           </w:p>
         </w:tc>
@@ -50665,7 +51085,7 @@
               <w:rPr>
                 <w:sz w:val="18"/>
               </w:rPr>
-              <w:t xml:space="preserve">Derechos de autor por música (Sayco–Acinpro / OSA)</w:t>
+              <w:t xml:space="preserve">Seguros (todo riesgo y responsabilidad civil)</w:t>
             </w:r>
           </w:p>
         </w:tc>
@@ -50683,7 +51103,7 @@
               <w:rPr>
                 <w:sz w:val="18"/>
               </w:rPr>
-              <w:t xml:space="preserve">$120.000</w:t>
+              <w:t xml:space="preserve">$550.000</w:t>
             </w:r>
           </w:p>
         </w:tc>
@@ -50722,7 +51142,7 @@
               <w:rPr>
                 <w:sz w:val="18"/>
               </w:rPr>
-              <w:t xml:space="preserve">Software y plataformas</w:t>
+              <w:t xml:space="preserve">Derechos de autor por música (Sayco–Acinpro / OSA)</w:t>
             </w:r>
           </w:p>
         </w:tc>
@@ -50738,7 +51158,7 @@
               <w:rPr>
                 <w:sz w:val="18"/>
               </w:rPr>
-              <w:t xml:space="preserve">$525.000</w:t>
+              <w:t xml:space="preserve">$120.000</w:t>
             </w:r>
           </w:p>
         </w:tc>
@@ -50777,7 +51197,7 @@
               <w:rPr>
                 <w:sz w:val="18"/>
               </w:rPr>
-              <w:t xml:space="preserve">Depreciación de equipos, mobiliario, adecuación y tecnología</w:t>
+              <w:t xml:space="preserve">Software y plataformas</w:t>
             </w:r>
           </w:p>
         </w:tc>
@@ -50795,7 +51215,7 @@
               <w:rPr>
                 <w:sz w:val="18"/>
               </w:rPr>
-              <w:t xml:space="preserve">$3.999.945</w:t>
+              <w:t xml:space="preserve">$525.000</w:t>
             </w:r>
           </w:p>
         </w:tc>
@@ -50813,7 +51233,7 @@
               <w:rPr>
                 <w:sz w:val="18"/>
               </w:rPr>
-              <w:t xml:space="preserve">Fijo (no desembolsable)</w:t>
+              <w:t xml:space="preserve">Fijo</w:t>
             </w:r>
           </w:p>
         </w:tc>
@@ -50832,6 +51252,61 @@
             </w:pPr>
             <w:r>
               <w:rPr>
+                <w:sz w:val="18"/>
+              </w:rPr>
+              <w:t xml:space="preserve">Depreciación de equipos, mobiliario, adecuación y tecnología</w:t>
+            </w:r>
+          </w:p>
+        </w:tc>
+        <w:tc>
+          <w:tcPr/>
+          <w:p>
+            <w:pPr>
+              <w:pStyle w:val="Compact"/>
+              <w:spacing w:after="0" w:before="0" w:line="240" w:lineRule="auto"/>
+              <w:jc w:val="right"/>
+            </w:pPr>
+            <w:r>
+              <w:rPr>
+                <w:sz w:val="18"/>
+              </w:rPr>
+              <w:t xml:space="preserve">$3.999.945</w:t>
+            </w:r>
+          </w:p>
+        </w:tc>
+        <w:tc>
+          <w:tcPr/>
+          <w:p>
+            <w:pPr>
+              <w:pStyle w:val="Compact"/>
+              <w:spacing w:after="0" w:before="0" w:line="240" w:lineRule="auto"/>
+              <w:jc w:val="left"/>
+            </w:pPr>
+            <w:r>
+              <w:rPr>
+                <w:sz w:val="18"/>
+              </w:rPr>
+              <w:t xml:space="preserve">Fijo (no desembolsable)</w:t>
+            </w:r>
+          </w:p>
+        </w:tc>
+      </w:tr>
+      <w:tr>
+        <w:trPr>
+          <w:cantSplit/>
+        </w:trPr>
+        <w:tc>
+          <w:tcPr>
+            <w:shd w:val="clear" w:color="auto" w:fill="F5F7FB"/>
+          </w:tcPr>
+          <w:p>
+            <w:pPr>
+              <w:pStyle w:val="Compact"/>
+              <w:spacing w:after="0" w:before="0" w:line="240" w:lineRule="auto"/>
+              <w:jc w:val="left"/>
+            </w:pPr>
+            <w:r>
+              <w:rPr>
                 <w:bCs/>
                 <w:b/>
                 <w:sz w:val="18"/>
@@ -50841,7 +51316,9 @@
           </w:p>
         </w:tc>
         <w:tc>
-          <w:tcPr/>
+          <w:tcPr>
+            <w:shd w:val="clear" w:color="auto" w:fill="F5F7FB"/>
+          </w:tcPr>
           <w:p>
             <w:pPr>
               <w:pStyle w:val="Compact"/>
@@ -50854,12 +51331,14 @@
                 <w:b/>
                 <w:sz w:val="18"/>
               </w:rPr>
-              <w:t xml:space="preserve">$90.097.203</w:t>
-            </w:r>
-          </w:p>
-        </w:tc>
-        <w:tc>
-          <w:tcPr/>
+              <w:t xml:space="preserve">$92.107.395</w:t>
+            </w:r>
+          </w:p>
+        </w:tc>
+        <w:tc>
+          <w:tcPr>
+            <w:shd w:val="clear" w:color="auto" w:fill="F5F7FB"/>
+          </w:tcPr>
           <w:p>
             <w:pPr>
               <w:pStyle w:val="Compact"/>
@@ -50983,10 +51462,10 @@
           <w:bCs/>
           <w:b/>
         </w:rPr>
-        <w:t xml:space="preserve">$394.891.102</w:t>
+        <w:t xml:space="preserve">$396.901.294</w:t>
       </w:r>
       <w:r>
-        <w:t xml:space="preserve">, de la cual la maquinaria y los equipos representan el 47,9 % (con el ultracongelador y la planta eléctrica como partidas clave para la inocuidad y la continuidad de la cadena de frío) y la adecuación del local el 30,6 %. En la operación, la nómina y los insumos de los tres platos son los costos más altos; el costo de materia prima por plato ($9.255 a $12.120) deja un food cost de 25 % a 34 %, dentro del rango de 28 % a 35 % que reporta Gordon Food Service para restaurantes rentables (Rivers, s.f.).</w:t>
+        <w:t xml:space="preserve">, de la cual la maquinaria y los equipos representan el 47,7 % (con el ultracongelador y la planta eléctrica como partidas clave para la inocuidad y la continuidad de la cadena de frío) y la adecuación del local el 30,4 %. En la operación, la nómina y los insumos de los tres platos son los costos más altos; el costo de materia prima por plato ($11.087 a $12.120) deja un food cost de 30 % a 34 %, dentro del rango de 28 % a 35 % que reporta Gordon Food Service para restaurantes rentables (Rivers, s.f.).</w:t>
       </w:r>
     </w:p>
     <w:bookmarkEnd w:id="91"/>
@@ -50998,6 +51477,14 @@
       </w:pPr>
       <w:r>
         <w:t xml:space="preserve">Conclusiones del estudio técnico</w:t>
+      </w:r>
+    </w:p>
+    <w:p>
+      <w:pPr>
+        <w:pStyle w:val="FirstParagraph"/>
+      </w:pPr>
+      <w:r>
+        <w:t xml:space="preserve">La tabla resume las decisiones técnicas del proyecto y la cifra que respalda cada una.</w:t>
       </w:r>
     </w:p>
     <w:p>
@@ -51232,7 +51719,7 @@
               <w:rPr>
                 <w:sz w:val="18"/>
               </w:rPr>
-              <w:t xml:space="preserve">23 % del costo de materia prima es local; precios verificados en SIPSA-DANE y proveedores; importados con stock de seguridad de 30 días</w:t>
+              <w:t xml:space="preserve">24 % del costo de materia prima es local; precios verificados en SIPSA-DANE y proveedores; importados con stock de seguridad de 30 días</w:t>
             </w:r>
           </w:p>
         </w:tc>
@@ -51269,7 +51756,7 @@
               <w:rPr>
                 <w:sz w:val="18"/>
               </w:rPr>
-              <w:t xml:space="preserve">Inversión técnica de $394.891.102; costos unitarios de $9.936 a $13.189 por plato</w:t>
+              <w:t xml:space="preserve">Inversión técnica de $396.901.294; costos unitarios de $11.768 a $13.189 por plato</w:t>
             </w:r>
           </w:p>
         </w:tc>
@@ -51333,31 +51820,7 @@
         <w:pStyle w:val="FirstParagraph"/>
       </w:pPr>
       <w:r>
-        <w:t xml:space="preserve">Agronegocios. (2026, 26 de octubre).</w:t>
-      </w:r>
-      <w:r>
-        <w:t xml:space="preserve"> </w:t>
-      </w:r>
-      <w:r>
-        <w:rPr>
-          <w:iCs/>
-          <w:i/>
-        </w:rPr>
-        <w:t xml:space="preserve">Precios del agro en Cartagena</w:t>
-      </w:r>
-      <w:r>
-        <w:t xml:space="preserve"> </w:t>
-      </w:r>
-      <w:r>
-        <w:t xml:space="preserve">[Datos del SIPSA-DANE]. https://www.agronegocios.co/precios/repollo-blanco/caribe/bolivar/cartagena</w:t>
-      </w:r>
-    </w:p>
-    <w:p>
-      <w:pPr>
-        <w:pStyle w:val="BodyText"/>
-      </w:pPr>
-      <w:r>
-        <w:t xml:space="preserve">Agronegocios. (2026, 26 de octubre).</w:t>
+        <w:t xml:space="preserve">Agronegocios. (2026, 24 de octubre).</w:t>
       </w:r>
       <w:r>
         <w:t xml:space="preserve"> </w:t>
@@ -51381,7 +51844,7 @@
         <w:pStyle w:val="BodyText"/>
       </w:pPr>
       <w:r>
-        <w:t xml:space="preserve">Aleluya. (2026).</w:t>
+        <w:t xml:space="preserve">Agronegocios. (2026, 24 de octubre).</w:t>
       </w:r>
       <w:r>
         <w:t xml:space="preserve"> </w:t>
@@ -51391,10 +51854,13 @@
           <w:iCs/>
           <w:i/>
         </w:rPr>
-        <w:t xml:space="preserve">Costo de un empleado en Colombia 2026</w:t>
+        <w:t xml:space="preserve">Precios del agro en Cartagena (Bazurto)</w:t>
       </w:r>
       <w:r>
-        <w:t xml:space="preserve">. https://aleluya.com/blog/nomina/costo-de-un-empleado-en-colombia-2026/</w:t>
+        <w:t xml:space="preserve"> </w:t>
+      </w:r>
+      <w:r>
+        <w:t xml:space="preserve">[Datos del SIPSA-DANE]. https://www.agronegocios.co/precios/azucar-refinada/caribe/bolivar/cartagena</w:t>
       </w:r>
     </w:p>
     <w:p>
@@ -51416,6 +51882,27 @@
       </w:r>
       <w:r>
         <w:t xml:space="preserve">.</w:t>
+      </w:r>
+    </w:p>
+    <w:p>
+      <w:pPr>
+        <w:pStyle w:val="BodyText"/>
+      </w:pPr>
+      <w:r>
+        <w:t xml:space="preserve">Aleluya. (2026).</w:t>
+      </w:r>
+      <w:r>
+        <w:t xml:space="preserve"> </w:t>
+      </w:r>
+      <w:r>
+        <w:rPr>
+          <w:iCs/>
+          <w:i/>
+        </w:rPr>
+        <w:t xml:space="preserve">Costo de un empleado en Colombia 2026</w:t>
+      </w:r>
+      <w:r>
+        <w:t xml:space="preserve">. https://aleluya.com/blog/nomina/costo-de-un-empleado-en-colombia-2026/</w:t>
       </w:r>
     </w:p>
     <w:p>
@@ -51461,6 +51948,27 @@
       </w:r>
       <w:r>
         <w:t xml:space="preserve">(7.ª ed.). McGraw-Hill.</w:t>
+      </w:r>
+    </w:p>
+    <w:p>
+      <w:pPr>
+        <w:pStyle w:val="BodyText"/>
+      </w:pPr>
+      <w:r>
+        <w:t xml:space="preserve">Cartagena Cómo Vamos. (2023).</w:t>
+      </w:r>
+      <w:r>
+        <w:t xml:space="preserve"> </w:t>
+      </w:r>
+      <w:r>
+        <w:rPr>
+          <w:iCs/>
+          <w:i/>
+        </w:rPr>
+        <w:t xml:space="preserve">Servicios públicos: Encuesta de Percepción Ciudadana 2023</w:t>
+      </w:r>
+      <w:r>
+        <w:t xml:space="preserve">. https://cartagenacomovamos.org/wp-content/uploads/2023/12/servicios-publicos-epc-2023-cartagenacomovamos-INF.pdf</w:t>
       </w:r>
     </w:p>
     <w:p>
@@ -51854,30 +52362,6 @@
         <w:pStyle w:val="BodyText"/>
       </w:pPr>
       <w:r>
-        <w:t xml:space="preserve">Miranda Miranda, J. J. (2005).</w:t>
-      </w:r>
-      <w:r>
-        <w:t xml:space="preserve"> </w:t>
-      </w:r>
-      <w:r>
-        <w:rPr>
-          <w:iCs/>
-          <w:i/>
-        </w:rPr>
-        <w:t xml:space="preserve">Gestión de proyectos: identificación, formulación, evaluación financiera, económica, social, ambiental</w:t>
-      </w:r>
-      <w:r>
-        <w:t xml:space="preserve"> </w:t>
-      </w:r>
-      <w:r>
-        <w:t xml:space="preserve">(5.ª ed.). MM Editores.</w:t>
-      </w:r>
-    </w:p>
-    <w:p>
-      <w:pPr>
-        <w:pStyle w:val="BodyText"/>
-      </w:pPr>
-      <w:r>
         <w:t xml:space="preserve">Ministerio de Agricultura y Desarrollo Rural. (2015).</w:t>
       </w:r>
       <w:r>
@@ -51976,6 +52460,30 @@
       </w:r>
       <w:r>
         <w:t xml:space="preserve">.</w:t>
+      </w:r>
+    </w:p>
+    <w:p>
+      <w:pPr>
+        <w:pStyle w:val="BodyText"/>
+      </w:pPr>
+      <w:r>
+        <w:t xml:space="preserve">Miranda Miranda, J. J. (2005).</w:t>
+      </w:r>
+      <w:r>
+        <w:t xml:space="preserve"> </w:t>
+      </w:r>
+      <w:r>
+        <w:rPr>
+          <w:iCs/>
+          <w:i/>
+        </w:rPr>
+        <w:t xml:space="preserve">Gestión de proyectos: identificación, formulación, evaluación financiera, económica, social, ambiental</w:t>
+      </w:r>
+      <w:r>
+        <w:t xml:space="preserve"> </w:t>
+      </w:r>
+      <w:r>
+        <w:t xml:space="preserve">(5.ª ed.). MM Editores.</w:t>
       </w:r>
     </w:p>
     <w:p>
@@ -52111,6 +52619,14 @@
         <w:t xml:space="preserve">Estado de verificación de los precios</w:t>
       </w:r>
     </w:p>
+    <w:p>
+      <w:pPr>
+        <w:pStyle w:val="FirstParagraph"/>
+      </w:pPr>
+      <w:r>
+        <w:t xml:space="preserve">La tabla indica, para cada grupo de precios usados en el estudio, de dónde se obtuvo, cuándo se consultó y si es un dato verificado o una estimación del equipo.</w:t>
+      </w:r>
+    </w:p>
     <w:tbl>
       <w:tblPr>
         <w:tblStyle w:val="Table"/>
@@ -52273,7 +52789,7 @@
               <w:rPr>
                 <w:sz w:val="18"/>
               </w:rPr>
-              <w:t xml:space="preserve">24-26 oct. 2026</w:t>
+              <w:t xml:space="preserve">24 oct. 2026</w:t>
             </w:r>
           </w:p>
         </w:tc>

</xml_diff>